<commit_message>
Reorder second half of the schedule
- Week 7: uncertainty & statistics, Lab 6 now statistical plots
- Week 8: three days of Project 1 presentations
- Graphs, networks & trees moves to Thanksgiving week, after interactivity
- Week 15 is final presentations; Project 2 due Dec 4
- Dec 7: Worst Chart Contest
- Syllabus updates

Co-Authored-By: Claude Opus 5.5 <noreply@anthropic.com>
</commit_message>
<xml_diff>
--- a/DS2003_Syllabus Fall 2026.docx
+++ b/DS2003_Syllabus Fall 2026.docx
@@ -1835,7 +1835,7 @@
                 <w:sz w:val="20"/>
                 <w:szCs w:val="20"/>
               </w:rPr>
-              <w:t>EDA I</w:t>
+              <w:t>Anatomy of a figure</w:t>
             </w:r>
           </w:p>
         </w:tc>
@@ -2001,8 +2001,35 @@
                 <w:sz w:val="20"/>
                 <w:szCs w:val="20"/>
               </w:rPr>
-              <w:t>EDA II</w:t>
-            </w:r>
+              <w:t>More EDA -</w:t>
+            </w:r>
+            <w:r>
+              <w:rPr>
+                <w:rFonts w:asciiTheme="minorHAnsi" w:hAnsiTheme="minorHAnsi"/>
+                <w:b/>
+                <w:bCs/>
+                <w:sz w:val="20"/>
+                <w:szCs w:val="20"/>
+              </w:rPr>
+              <w:t xml:space="preserve"> </w:t>
+            </w:r>
+            <w:r>
+              <w:rPr>
+                <w:rFonts w:asciiTheme="minorHAnsi" w:hAnsiTheme="minorHAnsi"/>
+                <w:sz w:val="20"/>
+                <w:szCs w:val="20"/>
+              </w:rPr>
+              <w:t>Encodings, Color, and Chart Types</w:t>
+            </w:r>
+          </w:p>
+          <w:p>
+            <w:pPr>
+              <w:rPr>
+                <w:rFonts w:asciiTheme="minorHAnsi" w:hAnsiTheme="minorHAnsi"/>
+                <w:sz w:val="20"/>
+                <w:szCs w:val="20"/>
+              </w:rPr>
+            </w:pPr>
           </w:p>
         </w:tc>
         <w:tc>
@@ -2167,7 +2194,7 @@
                 <w:sz w:val="20"/>
                 <w:szCs w:val="20"/>
               </w:rPr>
-              <w:t>EDA III</w:t>
+              <w:t>Bad Chart Redesign</w:t>
             </w:r>
           </w:p>
         </w:tc>
@@ -2481,6 +2508,7 @@
         <w:tc>
           <w:tcPr>
             <w:tcW w:w="2005" w:type="dxa"/>
+            <w:shd w:val="clear" w:color="auto" w:fill="CAEDFB" w:themeFill="accent4" w:themeFillTint="33"/>
           </w:tcPr>
           <w:p>
             <w:pPr>
@@ -2496,15 +2524,7 @@
                 <w:sz w:val="20"/>
                 <w:szCs w:val="20"/>
               </w:rPr>
-              <w:t xml:space="preserve">Lab 7: </w:t>
-            </w:r>
-            <w:r>
-              <w:rPr>
-                <w:rFonts w:asciiTheme="minorHAnsi" w:hAnsiTheme="minorHAnsi"/>
-                <w:sz w:val="20"/>
-                <w:szCs w:val="20"/>
-              </w:rPr>
-              <w:t>Intro to storytelling with data</w:t>
+              <w:t>P1 Presentations</w:t>
             </w:r>
           </w:p>
         </w:tc>
@@ -2686,27 +2706,74 @@
             <w:pPr>
               <w:rPr>
                 <w:rFonts w:asciiTheme="minorHAnsi" w:hAnsiTheme="minorHAnsi"/>
-                <w:sz w:val="20"/>
-                <w:szCs w:val="20"/>
-              </w:rPr>
-            </w:pPr>
-            <w:r>
-              <w:rPr>
-                <w:rFonts w:asciiTheme="minorHAnsi" w:hAnsiTheme="minorHAnsi"/>
-                <w:sz w:val="20"/>
-                <w:szCs w:val="20"/>
-              </w:rPr>
-              <w:t xml:space="preserve">No class </w:t>
-            </w:r>
-            <w:r>
-              <w:rPr>
-                <w:rFonts w:asciiTheme="minorHAnsi" w:hAnsiTheme="minorHAnsi"/>
                 <w:i/>
                 <w:iCs/>
                 <w:sz w:val="20"/>
                 <w:szCs w:val="20"/>
               </w:rPr>
+            </w:pPr>
+            <w:r>
+              <w:rPr>
+                <w:rFonts w:asciiTheme="minorHAnsi" w:hAnsiTheme="minorHAnsi"/>
+                <w:sz w:val="20"/>
+                <w:szCs w:val="20"/>
+              </w:rPr>
+              <w:t xml:space="preserve">No class </w:t>
+            </w:r>
+            <w:r>
+              <w:rPr>
+                <w:rFonts w:asciiTheme="minorHAnsi" w:hAnsiTheme="minorHAnsi"/>
+                <w:i/>
+                <w:iCs/>
+                <w:sz w:val="20"/>
+                <w:szCs w:val="20"/>
+              </w:rPr>
               <w:t>(Family weekend)</w:t>
+            </w:r>
+            <w:r>
+              <w:rPr>
+                <w:rFonts w:asciiTheme="minorHAnsi" w:hAnsiTheme="minorHAnsi"/>
+                <w:i/>
+                <w:iCs/>
+                <w:sz w:val="20"/>
+                <w:szCs w:val="20"/>
+              </w:rPr>
+              <w:t xml:space="preserve"> </w:t>
+            </w:r>
+          </w:p>
+          <w:p>
+            <w:pPr>
+              <w:rPr>
+                <w:rFonts w:asciiTheme="minorHAnsi" w:hAnsiTheme="minorHAnsi"/>
+                <w:sz w:val="20"/>
+                <w:szCs w:val="20"/>
+              </w:rPr>
+            </w:pPr>
+            <w:r>
+              <w:rPr>
+                <w:rFonts w:asciiTheme="minorHAnsi" w:hAnsiTheme="minorHAnsi"/>
+                <w:sz w:val="20"/>
+                <w:szCs w:val="20"/>
+              </w:rPr>
+              <w:t>Async</w:t>
+            </w:r>
+            <w:r>
+              <w:rPr>
+                <w:rFonts w:asciiTheme="minorHAnsi" w:hAnsiTheme="minorHAnsi"/>
+                <w:i/>
+                <w:iCs/>
+                <w:sz w:val="20"/>
+                <w:szCs w:val="20"/>
+              </w:rPr>
+              <w:t xml:space="preserve"> </w:t>
+            </w:r>
+            <w:r>
+              <w:rPr>
+                <w:rFonts w:asciiTheme="minorHAnsi" w:hAnsiTheme="minorHAnsi"/>
+                <w:sz w:val="20"/>
+                <w:szCs w:val="20"/>
+              </w:rPr>
+              <w:t>Lab 7: Intro to storytelling with data</w:t>
             </w:r>
           </w:p>
         </w:tc>
@@ -9456,7 +9523,7 @@
               <w:sz w:val="18"/>
               <w:szCs w:val="18"/>
             </w:rPr>
-            <w:t>August 25, 2026</w:t>
+            <w:t>October 1, 2026</w:t>
           </w:r>
           <w:r>
             <w:rPr>
@@ -13393,7 +13460,6 @@
   <w:style w:type="character" w:default="1" w:styleId="DefaultParagraphFont">
     <w:name w:val="Default Paragraph Font"/>
     <w:uiPriority w:val="1"/>
-    <w:semiHidden/>
     <w:unhideWhenUsed/>
   </w:style>
   <w:style w:type="table" w:default="1" w:styleId="TableNormal">
@@ -14243,6 +14309,15 @@
 </file>
 
 <file path=customXml/item1.xml><?xml version="1.0" encoding="utf-8"?>
+<?mso-contentType ?>
+<FormTemplates xmlns="http://schemas.microsoft.com/sharepoint/v3/contenttype/forms">
+  <Display>DocumentLibraryForm</Display>
+  <Edit>DocumentLibraryForm</Edit>
+  <New>DocumentLibraryForm</New>
+</FormTemplates>
+</file>
+
+<file path=customXml/item2.xml><?xml version="1.0" encoding="utf-8"?>
 <ct:contentTypeSchema xmlns:ct="http://schemas.microsoft.com/office/2006/metadata/contentType" xmlns:ma="http://schemas.microsoft.com/office/2006/metadata/properties/metaAttributes" ct:_="" ma:_="" ma:contentTypeName="Document" ma:contentTypeID="0x010100A80218729E06E148BF2EE221A7C88265" ma:contentTypeVersion="17" ma:contentTypeDescription="Create a new document." ma:contentTypeScope="" ma:versionID="a67b63302dde074774d205406435ff84">
   <xsd:schema xmlns:xsd="http://www.w3.org/2001/XMLSchema" xmlns:xs="http://www.w3.org/2001/XMLSchema" xmlns:p="http://schemas.microsoft.com/office/2006/metadata/properties" xmlns:ns2="f371c961-e43e-4183-879d-6f7f247769d3" xmlns:ns3="ed0d44ba-ad56-46b4-bfa1-f2d95a63ab0c" targetNamespace="http://schemas.microsoft.com/office/2006/metadata/properties" ma:root="true" ma:fieldsID="dcc4313c1cec8fe674a487fed70e5036" ns2:_="" ns3:_="">
     <xsd:import namespace="f371c961-e43e-4183-879d-6f7f247769d3"/>
@@ -14491,15 +14566,6 @@
 </ct:contentTypeSchema>
 </file>
 
-<file path=customXml/item2.xml><?xml version="1.0" encoding="utf-8"?>
-<?mso-contentType ?>
-<FormTemplates xmlns="http://schemas.microsoft.com/sharepoint/v3/contenttype/forms">
-  <Display>DocumentLibraryForm</Display>
-  <Edit>DocumentLibraryForm</Edit>
-  <New>DocumentLibraryForm</New>
-</FormTemplates>
-</file>
-
 <file path=customXml/item3.xml><?xml version="1.0" encoding="utf-8"?>
 <p:properties xmlns:p="http://schemas.microsoft.com/office/2006/metadata/properties" xmlns:xsi="http://www.w3.org/2001/XMLSchema-instance" xmlns:pc="http://schemas.microsoft.com/office/infopath/2007/PartnerControls">
   <documentManagement>
@@ -14512,6 +14578,14 @@
 </file>
 
 <file path=customXml/itemProps1.xml><?xml version="1.0" encoding="utf-8"?>
+<ds:datastoreItem xmlns:ds="http://schemas.openxmlformats.org/officeDocument/2006/customXml" ds:itemID="{CFF60C86-97CC-463A-95D7-A0CD9B6F83C2}">
+  <ds:schemaRefs>
+    <ds:schemaRef ds:uri="http://schemas.microsoft.com/sharepoint/v3/contenttype/forms"/>
+  </ds:schemaRefs>
+</ds:datastoreItem>
+</file>
+
+<file path=customXml/itemProps2.xml><?xml version="1.0" encoding="utf-8"?>
 <ds:datastoreItem xmlns:ds="http://schemas.openxmlformats.org/officeDocument/2006/customXml" ds:itemID="{9E9B7921-F871-48E8-8F20-FADA0B8149C4}">
   <ds:schemaRefs>
     <ds:schemaRef ds:uri="http://schemas.microsoft.com/office/2006/metadata/contentType"/>
@@ -14526,14 +14600,6 @@
     <ds:schemaRef ds:uri="http://purl.org/dc/elements/1.1/"/>
     <ds:schemaRef ds:uri="http://purl.org/dc/terms/"/>
     <ds:schemaRef ds:uri="http://schemas.microsoft.com/internal/obd"/>
-  </ds:schemaRefs>
-</ds:datastoreItem>
-</file>
-
-<file path=customXml/itemProps2.xml><?xml version="1.0" encoding="utf-8"?>
-<ds:datastoreItem xmlns:ds="http://schemas.openxmlformats.org/officeDocument/2006/customXml" ds:itemID="{CFF60C86-97CC-463A-95D7-A0CD9B6F83C2}">
-  <ds:schemaRefs>
-    <ds:schemaRef ds:uri="http://schemas.microsoft.com/sharepoint/v3/contenttype/forms"/>
   </ds:schemaRefs>
 </ds:datastoreItem>
 </file>

</xml_diff>

<commit_message>
Rework second half around Project 2 (interactive notebook + final piece)
- Reorder weeks 9-14: storytelling & narrative, interaction, ipywidgets,
  networks & trees, infographics, sci vis & journalism, data quality,
  critique, ethics
- Add Labs 7 (interactive EDA with Plotly) and 9 (treemaps & sunbursts),
  adapted from Bako's labs, plus the superstore dataset
- Add Project 2 assignment and rubric
- Update syllabus schedule, P2 description, and grade table

Co-Authored-By: Claude Opus 5.5 <noreply@anthropic.com>
</commit_message>
<xml_diff>
--- a/DS2003_Syllabus Fall 2026.docx
+++ b/DS2003_Syllabus Fall 2026.docx
@@ -1653,15 +1653,7 @@
                 <w:sz w:val="20"/>
                 <w:szCs w:val="20"/>
               </w:rPr>
-              <w:t xml:space="preserve">Lab 2: </w:t>
-            </w:r>
-            <w:r>
-              <w:rPr>
-                <w:rFonts w:asciiTheme="minorHAnsi" w:hAnsiTheme="minorHAnsi"/>
-                <w:sz w:val="20"/>
-                <w:szCs w:val="20"/>
-              </w:rPr>
-              <w:t>Intro to matplotlib</w:t>
+              <w:t>Lab 2: Grouping and aggregating</w:t>
             </w:r>
           </w:p>
         </w:tc>
@@ -2286,7 +2278,7 @@
                 <w:sz w:val="20"/>
                 <w:szCs w:val="20"/>
               </w:rPr>
-              <w:t>Beyond tables</w:t>
+              <w:t>Statistical plots</w:t>
             </w:r>
           </w:p>
         </w:tc>
@@ -2331,7 +2323,7 @@
                 <w:sz w:val="20"/>
                 <w:szCs w:val="20"/>
               </w:rPr>
-              <w:t>Graphs, networks, and trees</w:t>
+              <w:t>Statistical plots and uncertainty</w:t>
             </w:r>
           </w:p>
         </w:tc>
@@ -2353,15 +2345,7 @@
                 <w:sz w:val="20"/>
                 <w:szCs w:val="20"/>
               </w:rPr>
-              <w:t xml:space="preserve">Lab 6: </w:t>
-            </w:r>
-            <w:r>
-              <w:rPr>
-                <w:rFonts w:asciiTheme="minorHAnsi" w:hAnsiTheme="minorHAnsi"/>
-                <w:sz w:val="20"/>
-                <w:szCs w:val="20"/>
-              </w:rPr>
-              <w:t>Alluvial diagrams</w:t>
+              <w:t>Lab 6: Statistical plots</w:t>
             </w:r>
           </w:p>
         </w:tc>
@@ -2429,7 +2413,7 @@
                 <w:sz w:val="20"/>
                 <w:szCs w:val="20"/>
               </w:rPr>
-              <w:t>Oct 14 &amp; 16</w:t>
+              <w:t>Oct 12 – 16</w:t>
             </w:r>
           </w:p>
         </w:tc>
@@ -2641,7 +2625,7 @@
                 <w:sz w:val="20"/>
                 <w:szCs w:val="20"/>
               </w:rPr>
-              <w:t>Composition</w:t>
+              <w:t>Storytelling &amp; interaction</w:t>
             </w:r>
           </w:p>
         </w:tc>
@@ -2663,15 +2647,7 @@
                 <w:sz w:val="20"/>
                 <w:szCs w:val="20"/>
               </w:rPr>
-              <w:t>Storytelling</w:t>
-            </w:r>
-            <w:r>
-              <w:rPr>
-                <w:rFonts w:asciiTheme="minorHAnsi" w:hAnsiTheme="minorHAnsi"/>
-                <w:sz w:val="20"/>
-                <w:szCs w:val="20"/>
-              </w:rPr>
-              <w:t xml:space="preserve"> I</w:t>
+              <w:t>Storytelling and narrative structures</w:t>
             </w:r>
           </w:p>
         </w:tc>
@@ -2693,7 +2669,7 @@
                 <w:sz w:val="20"/>
                 <w:szCs w:val="20"/>
               </w:rPr>
-              <w:t>Storytelling II</w:t>
+              <w:t>Interaction: why and when (taxonomies)</w:t>
             </w:r>
           </w:p>
         </w:tc>
@@ -2718,27 +2694,7 @@
                 <w:sz w:val="20"/>
                 <w:szCs w:val="20"/>
               </w:rPr>
-              <w:t xml:space="preserve">No class </w:t>
-            </w:r>
-            <w:r>
-              <w:rPr>
-                <w:rFonts w:asciiTheme="minorHAnsi" w:hAnsiTheme="minorHAnsi"/>
-                <w:i/>
-                <w:iCs/>
-                <w:sz w:val="20"/>
-                <w:szCs w:val="20"/>
-              </w:rPr>
-              <w:t>(Family weekend)</w:t>
-            </w:r>
-            <w:r>
-              <w:rPr>
-                <w:rFonts w:asciiTheme="minorHAnsi" w:hAnsiTheme="minorHAnsi"/>
-                <w:i/>
-                <w:iCs/>
-                <w:sz w:val="20"/>
-                <w:szCs w:val="20"/>
-              </w:rPr>
-              <w:t xml:space="preserve"> </w:t>
+              <w:t>No class (Family weekend)</w:t>
             </w:r>
           </w:p>
           <w:p>
@@ -2755,25 +2711,7 @@
                 <w:sz w:val="20"/>
                 <w:szCs w:val="20"/>
               </w:rPr>
-              <w:t>Async</w:t>
-            </w:r>
-            <w:r>
-              <w:rPr>
-                <w:rFonts w:asciiTheme="minorHAnsi" w:hAnsiTheme="minorHAnsi"/>
-                <w:i/>
-                <w:iCs/>
-                <w:sz w:val="20"/>
-                <w:szCs w:val="20"/>
-              </w:rPr>
-              <w:t xml:space="preserve"> </w:t>
-            </w:r>
-            <w:r>
-              <w:rPr>
-                <w:rFonts w:asciiTheme="minorHAnsi" w:hAnsiTheme="minorHAnsi"/>
-                <w:sz w:val="20"/>
-                <w:szCs w:val="20"/>
-              </w:rPr>
-              <w:t>Lab 7: Intro to storytelling with data</w:t>
+              <w:t>Async Lab 7: Interactive EDA with Plotly</w:t>
             </w:r>
           </w:p>
         </w:tc>
@@ -2795,7 +2733,24 @@
                 <w:sz w:val="20"/>
                 <w:szCs w:val="20"/>
               </w:rPr>
-              <w:t>P2 Assigned</w:t>
+              <w:t>P2 assigned</w:t>
+            </w:r>
+          </w:p>
+          <w:p>
+            <w:pPr>
+              <w:rPr>
+                <w:rFonts w:asciiTheme="minorHAnsi" w:hAnsiTheme="minorHAnsi"/>
+                <w:sz w:val="20"/>
+                <w:szCs w:val="20"/>
+              </w:rPr>
+            </w:pPr>
+            <w:r>
+              <w:rPr>
+                <w:rFonts w:asciiTheme="minorHAnsi" w:hAnsiTheme="minorHAnsi"/>
+                <w:sz w:val="20"/>
+                <w:szCs w:val="20"/>
+              </w:rPr>
+              <w:t>P2 proposal due Sun</w:t>
             </w:r>
           </w:p>
         </w:tc>
@@ -2879,7 +2834,7 @@
                 <w:sz w:val="20"/>
                 <w:szCs w:val="20"/>
               </w:rPr>
-              <w:t>Infographics</w:t>
+              <w:t>Interactivity &amp; beyond tables</w:t>
             </w:r>
           </w:p>
         </w:tc>
@@ -2901,7 +2856,7 @@
                 <w:sz w:val="20"/>
                 <w:szCs w:val="20"/>
               </w:rPr>
-              <w:t xml:space="preserve">Infographics </w:t>
+              <w:t>Interactive notebooks with ipywidgets</w:t>
             </w:r>
           </w:p>
         </w:tc>
@@ -2923,7 +2878,7 @@
                 <w:sz w:val="20"/>
                 <w:szCs w:val="20"/>
               </w:rPr>
-              <w:t>Narrative Structures</w:t>
+              <w:t>Graphs, networks, and trees</w:t>
             </w:r>
           </w:p>
         </w:tc>
@@ -2945,15 +2900,7 @@
                 <w:sz w:val="20"/>
                 <w:szCs w:val="20"/>
               </w:rPr>
-              <w:t xml:space="preserve">Lab 8: </w:t>
-            </w:r>
-            <w:r>
-              <w:rPr>
-                <w:rFonts w:asciiTheme="minorHAnsi" w:hAnsiTheme="minorHAnsi"/>
-                <w:sz w:val="20"/>
-                <w:szCs w:val="20"/>
-              </w:rPr>
-              <w:t>Infographics I</w:t>
+              <w:t>Lab 8: ipywidgets</w:t>
             </w:r>
           </w:p>
         </w:tc>
@@ -2975,7 +2922,6 @@
                 <w:sz w:val="20"/>
                 <w:szCs w:val="20"/>
               </w:rPr>
-              <w:t>P2 proposals due</w:t>
             </w:r>
           </w:p>
         </w:tc>
@@ -3053,7 +2999,7 @@
                 <w:sz w:val="20"/>
                 <w:szCs w:val="20"/>
               </w:rPr>
-              <w:t>Applications of storytelling</w:t>
+              <w:t>Infographics</w:t>
             </w:r>
           </w:p>
         </w:tc>
@@ -3075,7 +3021,7 @@
                 <w:sz w:val="20"/>
                 <w:szCs w:val="20"/>
               </w:rPr>
-              <w:t>Science visualizations</w:t>
+              <w:t>Infographics</w:t>
             </w:r>
           </w:p>
         </w:tc>
@@ -3097,7 +3043,7 @@
                 <w:sz w:val="20"/>
                 <w:szCs w:val="20"/>
               </w:rPr>
-              <w:t>Data journalism</w:t>
+              <w:t>Infographics II: principles of design</w:t>
             </w:r>
           </w:p>
         </w:tc>
@@ -3119,7 +3065,7 @@
                 <w:sz w:val="20"/>
                 <w:szCs w:val="20"/>
               </w:rPr>
-              <w:t>Lab 9: Infographics II</w:t>
+              <w:t>Lab 9: Interactive treemaps and sunbursts</w:t>
             </w:r>
           </w:p>
         </w:tc>
@@ -3213,19 +3159,8 @@
                 <w:sz w:val="20"/>
                 <w:szCs w:val="20"/>
               </w:rPr>
-              <w:t>Interactivity</w:t>
-            </w:r>
-          </w:p>
-          <w:p>
-            <w:pPr>
-              <w:rPr>
-                <w:rFonts w:asciiTheme="minorHAnsi" w:hAnsiTheme="minorHAnsi"/>
-                <w:i/>
-                <w:iCs/>
-                <w:sz w:val="20"/>
-                <w:szCs w:val="20"/>
-              </w:rPr>
-            </w:pPr>
+              <w:t>Applications of storytelling</w:t>
+            </w:r>
           </w:p>
         </w:tc>
         <w:tc>
@@ -3246,25 +3181,9 @@
                 <w:sz w:val="20"/>
                 <w:szCs w:val="20"/>
               </w:rPr>
-              <w:t>Intro to interactivity</w:t>
-            </w:r>
-            <w:r>
-              <w:rPr>
-                <w:rFonts w:asciiTheme="minorHAnsi" w:hAnsiTheme="minorHAnsi"/>
-                <w:sz w:val="20"/>
-                <w:szCs w:val="20"/>
-              </w:rPr>
-              <w:t xml:space="preserve">, </w:t>
+              <w:t>Science visualizations</w:t>
             </w:r>
             <w:proofErr w:type="spellStart"/>
-            <w:r>
-              <w:rPr>
-                <w:rFonts w:asciiTheme="minorHAnsi" w:hAnsiTheme="minorHAnsi"/>
-                <w:sz w:val="20"/>
-                <w:szCs w:val="20"/>
-              </w:rPr>
-              <w:t>ipywidgets</w:t>
-            </w:r>
             <w:proofErr w:type="spellEnd"/>
           </w:p>
         </w:tc>
@@ -3287,7 +3206,7 @@
                 <w:sz w:val="20"/>
                 <w:szCs w:val="20"/>
               </w:rPr>
-              <w:t>Plotly</w:t>
+              <w:t>Data journalism</w:t>
             </w:r>
             <w:proofErr w:type="spellEnd"/>
           </w:p>
@@ -3310,23 +3229,7 @@
                 <w:sz w:val="20"/>
                 <w:szCs w:val="20"/>
               </w:rPr>
-              <w:t xml:space="preserve">Lab </w:t>
-            </w:r>
-            <w:r>
-              <w:rPr>
-                <w:rFonts w:asciiTheme="minorHAnsi" w:hAnsiTheme="minorHAnsi"/>
-                <w:sz w:val="20"/>
-                <w:szCs w:val="20"/>
-              </w:rPr>
-              <w:t>10</w:t>
-            </w:r>
-            <w:r>
-              <w:rPr>
-                <w:rFonts w:asciiTheme="minorHAnsi" w:hAnsiTheme="minorHAnsi"/>
-                <w:sz w:val="20"/>
-                <w:szCs w:val="20"/>
-              </w:rPr>
-              <w:t>: Interactive plots</w:t>
+              <w:t>Lab 10: Sketching and annotation</w:t>
             </w:r>
           </w:p>
         </w:tc>
@@ -3420,7 +3323,7 @@
                 <w:sz w:val="20"/>
                 <w:szCs w:val="20"/>
               </w:rPr>
-              <w:t>Lies, Rhetoric &amp; Ethics</w:t>
+              <w:t>Lies, rhetoric &amp; critique</w:t>
             </w:r>
           </w:p>
         </w:tc>
@@ -3443,7 +3346,7 @@
                 <w:sz w:val="20"/>
                 <w:szCs w:val="20"/>
               </w:rPr>
-              <w:t>Common fallacies, deceptive encodings</w:t>
+              <w:t>P2 work session</w:t>
             </w:r>
           </w:p>
         </w:tc>
@@ -3466,23 +3369,7 @@
                 <w:sz w:val="20"/>
                 <w:szCs w:val="20"/>
               </w:rPr>
-              <w:t xml:space="preserve">Data </w:t>
-            </w:r>
-            <w:r>
-              <w:rPr>
-                <w:rFonts w:asciiTheme="minorHAnsi" w:hAnsiTheme="minorHAnsi"/>
-                <w:sz w:val="20"/>
-                <w:szCs w:val="20"/>
-              </w:rPr>
-              <w:t xml:space="preserve">quality, </w:t>
-            </w:r>
-            <w:r>
-              <w:rPr>
-                <w:rFonts w:asciiTheme="minorHAnsi" w:hAnsiTheme="minorHAnsi"/>
-                <w:sz w:val="20"/>
-                <w:szCs w:val="20"/>
-              </w:rPr>
-              <w:t>ethics, deceptive plots</w:t>
+              <w:t>Data quality and deceptive plots</w:t>
             </w:r>
           </w:p>
         </w:tc>
@@ -3505,31 +3392,354 @@
                 <w:sz w:val="20"/>
                 <w:szCs w:val="20"/>
               </w:rPr>
-              <w:t>Lab</w:t>
-            </w:r>
-            <w:r>
-              <w:rPr>
-                <w:rFonts w:asciiTheme="minorHAnsi" w:hAnsiTheme="minorHAnsi"/>
-                <w:sz w:val="20"/>
-                <w:szCs w:val="20"/>
-              </w:rPr>
-              <w:t xml:space="preserve"> 11</w:t>
-            </w:r>
-            <w:r>
-              <w:rPr>
-                <w:rFonts w:asciiTheme="minorHAnsi" w:hAnsiTheme="minorHAnsi"/>
-                <w:sz w:val="20"/>
-                <w:szCs w:val="20"/>
-              </w:rPr>
-              <w:t xml:space="preserve">: </w:t>
-            </w:r>
-            <w:r>
-              <w:rPr>
-                <w:rFonts w:asciiTheme="minorHAnsi" w:hAnsiTheme="minorHAnsi"/>
-                <w:sz w:val="20"/>
-                <w:szCs w:val="20"/>
-              </w:rPr>
-              <w:t>Chart redesign</w:t>
+              <w:t>P2 design critique</w:t>
+            </w:r>
+          </w:p>
+        </w:tc>
+        <w:tc>
+          <w:tcPr>
+            <w:tcW w:w="1275" w:type="dxa"/>
+          </w:tcPr>
+          <w:p>
+            <w:pPr>
+              <w:rPr>
+                <w:rFonts w:asciiTheme="minorHAnsi" w:hAnsiTheme="minorHAnsi"/>
+                <w:sz w:val="20"/>
+                <w:szCs w:val="20"/>
+              </w:rPr>
+            </w:pPr>
+            <w:r>
+              <w:rPr>
+                <w:rFonts w:asciiTheme="minorHAnsi" w:hAnsiTheme="minorHAnsi"/>
+                <w:sz w:val="20"/>
+                <w:szCs w:val="20"/>
+              </w:rPr>
+              <w:t>P2 final-piece sketches</w:t>
+            </w:r>
+          </w:p>
+        </w:tc>
+      </w:tr>
+      <w:tr>
+        <w:trPr>
+          <w:trHeight w:val="300"/>
+        </w:trPr>
+        <w:tc>
+          <w:tcPr>
+            <w:tcW w:w="555" w:type="dxa"/>
+          </w:tcPr>
+          <w:p>
+            <w:pPr>
+              <w:jc w:val="center"/>
+              <w:rPr>
+                <w:rFonts w:asciiTheme="minorHAnsi" w:hAnsiTheme="minorHAnsi"/>
+                <w:sz w:val="20"/>
+                <w:szCs w:val="20"/>
+              </w:rPr>
+            </w:pPr>
+            <w:r>
+              <w:rPr>
+                <w:rFonts w:asciiTheme="minorHAnsi" w:hAnsiTheme="minorHAnsi"/>
+                <w:b/>
+                <w:bCs/>
+                <w:sz w:val="20"/>
+                <w:szCs w:val="20"/>
+              </w:rPr>
+              <w:t>14</w:t>
+            </w:r>
+          </w:p>
+        </w:tc>
+        <w:tc>
+          <w:tcPr>
+            <w:tcW w:w="1140" w:type="dxa"/>
+          </w:tcPr>
+          <w:p>
+            <w:pPr>
+              <w:rPr>
+                <w:rFonts w:asciiTheme="minorHAnsi" w:hAnsiTheme="minorHAnsi"/>
+                <w:sz w:val="20"/>
+                <w:szCs w:val="20"/>
+              </w:rPr>
+            </w:pPr>
+            <w:r>
+              <w:rPr>
+                <w:rFonts w:asciiTheme="minorHAnsi" w:hAnsiTheme="minorHAnsi"/>
+                <w:i/>
+                <w:iCs/>
+                <w:sz w:val="20"/>
+                <w:szCs w:val="20"/>
+              </w:rPr>
+              <w:t>Nov 23</w:t>
+            </w:r>
+          </w:p>
+        </w:tc>
+        <w:tc>
+          <w:tcPr>
+            <w:tcW w:w="1815" w:type="dxa"/>
+          </w:tcPr>
+          <w:p>
+            <w:pPr>
+              <w:rPr>
+                <w:rFonts w:asciiTheme="minorHAnsi" w:hAnsiTheme="minorHAnsi"/>
+                <w:b/>
+                <w:bCs/>
+                <w:sz w:val="20"/>
+                <w:szCs w:val="20"/>
+              </w:rPr>
+            </w:pPr>
+            <w:r>
+              <w:rPr>
+                <w:rFonts w:asciiTheme="minorHAnsi" w:hAnsiTheme="minorHAnsi"/>
+                <w:b/>
+                <w:bCs/>
+                <w:sz w:val="20"/>
+                <w:szCs w:val="20"/>
+              </w:rPr>
+              <w:t>Ethics</w:t>
+            </w:r>
+          </w:p>
+        </w:tc>
+        <w:tc>
+          <w:tcPr>
+            <w:tcW w:w="2005" w:type="dxa"/>
+          </w:tcPr>
+          <w:p>
+            <w:pPr>
+              <w:rPr>
+                <w:rFonts w:asciiTheme="minorHAnsi" w:hAnsiTheme="minorHAnsi"/>
+                <w:sz w:val="20"/>
+                <w:szCs w:val="20"/>
+              </w:rPr>
+            </w:pPr>
+            <w:r>
+              <w:rPr>
+                <w:rFonts w:asciiTheme="minorHAnsi" w:hAnsiTheme="minorHAnsi"/>
+                <w:sz w:val="20"/>
+                <w:szCs w:val="20"/>
+              </w:rPr>
+              <w:t>Ethics and rhetoric</w:t>
+            </w:r>
+          </w:p>
+        </w:tc>
+        <w:tc>
+          <w:tcPr>
+            <w:tcW w:w="2005" w:type="dxa"/>
+            <w:shd w:val="clear" w:color="auto" w:fill="D9D9D9" w:themeFill="background1" w:themeFillShade="D9"/>
+          </w:tcPr>
+          <w:p>
+            <w:pPr>
+              <w:rPr>
+                <w:rFonts w:asciiTheme="minorHAnsi" w:hAnsiTheme="minorHAnsi"/>
+                <w:sz w:val="20"/>
+                <w:szCs w:val="20"/>
+              </w:rPr>
+            </w:pPr>
+            <w:r>
+              <w:rPr>
+                <w:rFonts w:asciiTheme="minorHAnsi" w:hAnsiTheme="minorHAnsi"/>
+                <w:sz w:val="20"/>
+                <w:szCs w:val="20"/>
+              </w:rPr>
+              <w:t xml:space="preserve">No Class </w:t>
+            </w:r>
+            <w:r>
+              <w:rPr>
+                <w:rFonts w:asciiTheme="minorHAnsi" w:hAnsiTheme="minorHAnsi"/>
+                <w:sz w:val="20"/>
+                <w:szCs w:val="20"/>
+              </w:rPr>
+              <w:t>(Thanksgiving)</w:t>
+            </w:r>
+          </w:p>
+        </w:tc>
+        <w:tc>
+          <w:tcPr>
+            <w:tcW w:w="2005" w:type="dxa"/>
+            <w:shd w:val="clear" w:color="auto" w:fill="D9D9D9" w:themeFill="background1" w:themeFillShade="D9"/>
+          </w:tcPr>
+          <w:p>
+            <w:pPr>
+              <w:rPr>
+                <w:rFonts w:asciiTheme="minorHAnsi" w:hAnsiTheme="minorHAnsi"/>
+                <w:sz w:val="20"/>
+                <w:szCs w:val="20"/>
+              </w:rPr>
+            </w:pPr>
+            <w:r>
+              <w:rPr>
+                <w:rFonts w:asciiTheme="minorHAnsi" w:hAnsiTheme="minorHAnsi"/>
+                <w:sz w:val="20"/>
+                <w:szCs w:val="20"/>
+              </w:rPr>
+              <w:t>No Class (Thanksgiving)</w:t>
+            </w:r>
+          </w:p>
+        </w:tc>
+        <w:tc>
+          <w:tcPr>
+            <w:tcW w:w="1275" w:type="dxa"/>
+          </w:tcPr>
+          <w:p>
+            <w:pPr>
+              <w:rPr>
+                <w:rFonts w:asciiTheme="minorHAnsi" w:hAnsiTheme="minorHAnsi"/>
+                <w:sz w:val="20"/>
+                <w:szCs w:val="20"/>
+              </w:rPr>
+            </w:pPr>
+            <w:r>
+              <w:rPr>
+                <w:rFonts w:asciiTheme="minorHAnsi" w:hAnsiTheme="minorHAnsi"/>
+                <w:sz w:val="20"/>
+                <w:szCs w:val="20"/>
+              </w:rPr>
+              <w:t>P2 notebook + slides due Sun 11/29</w:t>
+            </w:r>
+          </w:p>
+        </w:tc>
+      </w:tr>
+      <w:tr>
+        <w:trPr>
+          <w:trHeight w:val="300"/>
+        </w:trPr>
+        <w:tc>
+          <w:tcPr>
+            <w:tcW w:w="555" w:type="dxa"/>
+          </w:tcPr>
+          <w:p>
+            <w:pPr>
+              <w:jc w:val="center"/>
+              <w:rPr>
+                <w:rFonts w:asciiTheme="minorHAnsi" w:hAnsiTheme="minorHAnsi"/>
+                <w:sz w:val="20"/>
+                <w:szCs w:val="20"/>
+              </w:rPr>
+            </w:pPr>
+            <w:r>
+              <w:rPr>
+                <w:rFonts w:asciiTheme="minorHAnsi" w:hAnsiTheme="minorHAnsi"/>
+                <w:b/>
+                <w:bCs/>
+                <w:sz w:val="20"/>
+                <w:szCs w:val="20"/>
+              </w:rPr>
+              <w:t>15</w:t>
+            </w:r>
+          </w:p>
+        </w:tc>
+        <w:tc>
+          <w:tcPr>
+            <w:tcW w:w="1140" w:type="dxa"/>
+          </w:tcPr>
+          <w:p>
+            <w:pPr>
+              <w:rPr>
+                <w:rFonts w:asciiTheme="minorHAnsi" w:hAnsiTheme="minorHAnsi"/>
+                <w:sz w:val="20"/>
+                <w:szCs w:val="20"/>
+              </w:rPr>
+            </w:pPr>
+            <w:r>
+              <w:rPr>
+                <w:rFonts w:asciiTheme="minorHAnsi" w:hAnsiTheme="minorHAnsi"/>
+                <w:i/>
+                <w:iCs/>
+                <w:sz w:val="20"/>
+                <w:szCs w:val="20"/>
+              </w:rPr>
+              <w:t>Nov 30 – Dec 4</w:t>
+            </w:r>
+          </w:p>
+        </w:tc>
+        <w:tc>
+          <w:tcPr>
+            <w:tcW w:w="1815" w:type="dxa"/>
+          </w:tcPr>
+          <w:p>
+            <w:pPr>
+              <w:rPr>
+                <w:rFonts w:asciiTheme="minorHAnsi" w:hAnsiTheme="minorHAnsi"/>
+                <w:sz w:val="20"/>
+                <w:szCs w:val="20"/>
+              </w:rPr>
+            </w:pPr>
+            <w:r>
+              <w:rPr>
+                <w:rFonts w:asciiTheme="minorHAnsi" w:hAnsiTheme="minorHAnsi"/>
+                <w:b/>
+                <w:bCs/>
+                <w:sz w:val="20"/>
+                <w:szCs w:val="20"/>
+              </w:rPr>
+              <w:t>Final Presentations</w:t>
+            </w:r>
+          </w:p>
+        </w:tc>
+        <w:tc>
+          <w:tcPr>
+            <w:tcW w:w="2005" w:type="dxa"/>
+            <w:shd w:val="clear" w:color="auto" w:fill="CAEDFB" w:themeFill="accent4" w:themeFillTint="33"/>
+          </w:tcPr>
+          <w:p>
+            <w:pPr>
+              <w:rPr>
+                <w:rFonts w:asciiTheme="minorHAnsi" w:hAnsiTheme="minorHAnsi"/>
+                <w:sz w:val="20"/>
+                <w:szCs w:val="20"/>
+              </w:rPr>
+            </w:pPr>
+            <w:r>
+              <w:rPr>
+                <w:rFonts w:asciiTheme="minorHAnsi" w:hAnsiTheme="minorHAnsi"/>
+                <w:sz w:val="20"/>
+                <w:szCs w:val="20"/>
+              </w:rPr>
+              <w:t>Project Presentations (Day 1)</w:t>
+            </w:r>
+          </w:p>
+        </w:tc>
+        <w:tc>
+          <w:tcPr>
+            <w:tcW w:w="2005" w:type="dxa"/>
+            <w:shd w:val="clear" w:color="auto" w:fill="CAEDFB" w:themeFill="accent4" w:themeFillTint="33"/>
+          </w:tcPr>
+          <w:p>
+            <w:pPr>
+              <w:rPr>
+                <w:rFonts w:asciiTheme="minorHAnsi" w:hAnsiTheme="minorHAnsi"/>
+                <w:sz w:val="20"/>
+                <w:szCs w:val="20"/>
+              </w:rPr>
+            </w:pPr>
+            <w:r>
+              <w:rPr>
+                <w:rFonts w:asciiTheme="minorHAnsi" w:hAnsiTheme="minorHAnsi"/>
+                <w:sz w:val="20"/>
+                <w:szCs w:val="20"/>
+              </w:rPr>
+              <w:t>Project Presentations (Day 2)</w:t>
+            </w:r>
+          </w:p>
+        </w:tc>
+        <w:tc>
+          <w:tcPr>
+            <w:tcW w:w="2005" w:type="dxa"/>
+            <w:shd w:val="clear" w:color="auto" w:fill="CAEDFB" w:themeFill="accent4" w:themeFillTint="33"/>
+          </w:tcPr>
+          <w:p>
+            <w:pPr>
+              <w:rPr>
+                <w:rFonts w:asciiTheme="minorHAnsi" w:hAnsiTheme="minorHAnsi"/>
+                <w:sz w:val="20"/>
+                <w:szCs w:val="20"/>
+              </w:rPr>
+            </w:pPr>
+            <w:r>
+              <w:rPr>
+                <w:rFonts w:asciiTheme="minorHAnsi" w:hAnsiTheme="minorHAnsi"/>
+                <w:sz w:val="20"/>
+                <w:szCs w:val="20"/>
+              </w:rPr>
+              <w:t>Project Presentations (Day 3)</w:t>
             </w:r>
           </w:p>
         </w:tc>
@@ -3573,7 +3783,7 @@
                 <w:sz w:val="20"/>
                 <w:szCs w:val="20"/>
               </w:rPr>
-              <w:t>14</w:t>
+              <w:t>16</w:t>
             </w:r>
           </w:p>
         </w:tc>
@@ -3597,7 +3807,7 @@
                 <w:sz w:val="20"/>
                 <w:szCs w:val="20"/>
               </w:rPr>
-              <w:t>Nov 23</w:t>
+              <w:t>Dec 7</w:t>
             </w:r>
           </w:p>
         </w:tc>
@@ -3609,21 +3819,19 @@
             <w:pPr>
               <w:rPr>
                 <w:rFonts w:asciiTheme="minorHAnsi" w:hAnsiTheme="minorHAnsi"/>
+                <w:sz w:val="20"/>
+                <w:szCs w:val="20"/>
+              </w:rPr>
+            </w:pPr>
+            <w:r>
+              <w:rPr>
+                <w:rFonts w:asciiTheme="minorHAnsi" w:hAnsiTheme="minorHAnsi"/>
                 <w:b/>
                 <w:bCs/>
                 <w:sz w:val="20"/>
                 <w:szCs w:val="20"/>
               </w:rPr>
-            </w:pPr>
-            <w:r>
-              <w:rPr>
-                <w:rFonts w:asciiTheme="minorHAnsi" w:hAnsiTheme="minorHAnsi"/>
-                <w:b/>
-                <w:bCs/>
-                <w:sz w:val="20"/>
-                <w:szCs w:val="20"/>
-              </w:rPr>
-              <w:t>Uncertainty</w:t>
+              <w:t>Wrap-up</w:t>
             </w:r>
           </w:p>
         </w:tc>
@@ -3645,19 +3853,17 @@
                 <w:sz w:val="20"/>
                 <w:szCs w:val="20"/>
               </w:rPr>
-              <w:t>Communicating uncertainty</w:t>
+              <w:t>Last class: Worst Chart Contest</w:t>
             </w:r>
           </w:p>
         </w:tc>
         <w:tc>
           <w:tcPr>
             <w:tcW w:w="2005" w:type="dxa"/>
-            <w:shd w:val="clear" w:color="auto" w:fill="D9D9D9" w:themeFill="background1" w:themeFillShade="D9"/>
           </w:tcPr>
           <w:p>
             <w:pPr>
               <w:rPr>
-                <w:rFonts w:asciiTheme="minorHAnsi" w:hAnsiTheme="minorHAnsi"/>
                 <w:sz w:val="20"/>
                 <w:szCs w:val="20"/>
               </w:rPr>
@@ -3668,27 +3874,17 @@
                 <w:sz w:val="20"/>
                 <w:szCs w:val="20"/>
               </w:rPr>
-              <w:t xml:space="preserve">No Class </w:t>
-            </w:r>
-            <w:r>
-              <w:rPr>
-                <w:rFonts w:asciiTheme="minorHAnsi" w:hAnsiTheme="minorHAnsi"/>
-                <w:sz w:val="20"/>
-                <w:szCs w:val="20"/>
-              </w:rPr>
-              <w:t>(Thanksgiving)</w:t>
+              <w:t>___</w:t>
             </w:r>
           </w:p>
         </w:tc>
         <w:tc>
           <w:tcPr>
             <w:tcW w:w="2005" w:type="dxa"/>
-            <w:shd w:val="clear" w:color="auto" w:fill="D9D9D9" w:themeFill="background1" w:themeFillShade="D9"/>
           </w:tcPr>
           <w:p>
             <w:pPr>
               <w:rPr>
-                <w:rFonts w:asciiTheme="minorHAnsi" w:hAnsiTheme="minorHAnsi"/>
                 <w:sz w:val="20"/>
                 <w:szCs w:val="20"/>
               </w:rPr>
@@ -3699,7 +3895,7 @@
                 <w:sz w:val="20"/>
                 <w:szCs w:val="20"/>
               </w:rPr>
-              <w:t>No Class (Thanksgiving)</w:t>
+              <w:t>____</w:t>
             </w:r>
           </w:p>
         </w:tc>
@@ -3715,339 +3911,13 @@
                 <w:szCs w:val="20"/>
               </w:rPr>
             </w:pPr>
-          </w:p>
-        </w:tc>
-      </w:tr>
-      <w:tr>
-        <w:trPr>
-          <w:trHeight w:val="300"/>
-        </w:trPr>
-        <w:tc>
-          <w:tcPr>
-            <w:tcW w:w="555" w:type="dxa"/>
-          </w:tcPr>
-          <w:p>
-            <w:pPr>
-              <w:jc w:val="center"/>
-              <w:rPr>
-                <w:rFonts w:asciiTheme="minorHAnsi" w:hAnsiTheme="minorHAnsi"/>
-                <w:sz w:val="20"/>
-                <w:szCs w:val="20"/>
-              </w:rPr>
-            </w:pPr>
-            <w:r>
-              <w:rPr>
-                <w:rFonts w:asciiTheme="minorHAnsi" w:hAnsiTheme="minorHAnsi"/>
-                <w:b/>
-                <w:bCs/>
-                <w:sz w:val="20"/>
-                <w:szCs w:val="20"/>
-              </w:rPr>
-              <w:t>15</w:t>
-            </w:r>
-          </w:p>
-        </w:tc>
-        <w:tc>
-          <w:tcPr>
-            <w:tcW w:w="1140" w:type="dxa"/>
-          </w:tcPr>
-          <w:p>
-            <w:pPr>
-              <w:rPr>
-                <w:rFonts w:asciiTheme="minorHAnsi" w:hAnsiTheme="minorHAnsi"/>
-                <w:sz w:val="20"/>
-                <w:szCs w:val="20"/>
-              </w:rPr>
-            </w:pPr>
-            <w:r>
-              <w:rPr>
-                <w:rFonts w:asciiTheme="minorHAnsi" w:hAnsiTheme="minorHAnsi"/>
-                <w:i/>
-                <w:iCs/>
-                <w:sz w:val="20"/>
-                <w:szCs w:val="20"/>
-              </w:rPr>
-              <w:t>Nov 30 – Dec 4</w:t>
-            </w:r>
-          </w:p>
-        </w:tc>
-        <w:tc>
-          <w:tcPr>
-            <w:tcW w:w="1815" w:type="dxa"/>
-          </w:tcPr>
-          <w:p>
-            <w:pPr>
-              <w:rPr>
-                <w:rFonts w:asciiTheme="minorHAnsi" w:hAnsiTheme="minorHAnsi"/>
-                <w:sz w:val="20"/>
-                <w:szCs w:val="20"/>
-              </w:rPr>
-            </w:pPr>
-            <w:r>
-              <w:rPr>
-                <w:rFonts w:asciiTheme="minorHAnsi" w:hAnsiTheme="minorHAnsi"/>
-                <w:b/>
-                <w:bCs/>
-                <w:sz w:val="20"/>
-                <w:szCs w:val="20"/>
-              </w:rPr>
-              <w:t>Final Presentations</w:t>
-            </w:r>
-          </w:p>
-        </w:tc>
-        <w:tc>
-          <w:tcPr>
-            <w:tcW w:w="2005" w:type="dxa"/>
-            <w:shd w:val="clear" w:color="auto" w:fill="CAEDFB" w:themeFill="accent4" w:themeFillTint="33"/>
-          </w:tcPr>
-          <w:p>
-            <w:pPr>
-              <w:rPr>
-                <w:rFonts w:asciiTheme="minorHAnsi" w:hAnsiTheme="minorHAnsi"/>
-                <w:sz w:val="20"/>
-                <w:szCs w:val="20"/>
-              </w:rPr>
-            </w:pPr>
-            <w:r>
-              <w:rPr>
-                <w:rFonts w:asciiTheme="minorHAnsi" w:hAnsiTheme="minorHAnsi"/>
-                <w:sz w:val="20"/>
-                <w:szCs w:val="20"/>
-              </w:rPr>
-              <w:t>Project Presentations (Day 1)</w:t>
-            </w:r>
-          </w:p>
-        </w:tc>
-        <w:tc>
-          <w:tcPr>
-            <w:tcW w:w="2005" w:type="dxa"/>
-            <w:shd w:val="clear" w:color="auto" w:fill="CAEDFB" w:themeFill="accent4" w:themeFillTint="33"/>
-          </w:tcPr>
-          <w:p>
-            <w:pPr>
-              <w:rPr>
-                <w:rFonts w:asciiTheme="minorHAnsi" w:hAnsiTheme="minorHAnsi"/>
-                <w:sz w:val="20"/>
-                <w:szCs w:val="20"/>
-              </w:rPr>
-            </w:pPr>
-            <w:r>
-              <w:rPr>
-                <w:rFonts w:asciiTheme="minorHAnsi" w:hAnsiTheme="minorHAnsi"/>
-                <w:sz w:val="20"/>
-                <w:szCs w:val="20"/>
-              </w:rPr>
-              <w:t>Project Presentations (Day 2)</w:t>
-            </w:r>
-          </w:p>
-        </w:tc>
-        <w:tc>
-          <w:tcPr>
-            <w:tcW w:w="2005" w:type="dxa"/>
-            <w:shd w:val="clear" w:color="auto" w:fill="CAEDFB" w:themeFill="accent4" w:themeFillTint="33"/>
-          </w:tcPr>
-          <w:p>
-            <w:pPr>
-              <w:rPr>
-                <w:rFonts w:asciiTheme="minorHAnsi" w:hAnsiTheme="minorHAnsi"/>
-                <w:sz w:val="20"/>
-                <w:szCs w:val="20"/>
-              </w:rPr>
-            </w:pPr>
-            <w:r>
-              <w:rPr>
-                <w:rFonts w:asciiTheme="minorHAnsi" w:hAnsiTheme="minorHAnsi"/>
-                <w:sz w:val="20"/>
-                <w:szCs w:val="20"/>
-              </w:rPr>
-              <w:t>Project Presentations (Day 3)</w:t>
-            </w:r>
-          </w:p>
-        </w:tc>
-        <w:tc>
-          <w:tcPr>
-            <w:tcW w:w="1275" w:type="dxa"/>
-          </w:tcPr>
-          <w:p>
-            <w:pPr>
-              <w:rPr>
-                <w:rFonts w:asciiTheme="minorHAnsi" w:hAnsiTheme="minorHAnsi"/>
-                <w:sz w:val="20"/>
-                <w:szCs w:val="20"/>
-              </w:rPr>
-            </w:pPr>
-          </w:p>
-        </w:tc>
-      </w:tr>
-      <w:tr>
-        <w:trPr>
-          <w:trHeight w:val="300"/>
-        </w:trPr>
-        <w:tc>
-          <w:tcPr>
-            <w:tcW w:w="555" w:type="dxa"/>
-          </w:tcPr>
-          <w:p>
-            <w:pPr>
-              <w:jc w:val="center"/>
-              <w:rPr>
-                <w:rFonts w:asciiTheme="minorHAnsi" w:hAnsiTheme="minorHAnsi"/>
-                <w:sz w:val="20"/>
-                <w:szCs w:val="20"/>
-              </w:rPr>
-            </w:pPr>
-            <w:r>
-              <w:rPr>
-                <w:rFonts w:asciiTheme="minorHAnsi" w:hAnsiTheme="minorHAnsi"/>
-                <w:b/>
-                <w:bCs/>
-                <w:sz w:val="20"/>
-                <w:szCs w:val="20"/>
-              </w:rPr>
-              <w:t>16</w:t>
-            </w:r>
-          </w:p>
-        </w:tc>
-        <w:tc>
-          <w:tcPr>
-            <w:tcW w:w="1140" w:type="dxa"/>
-          </w:tcPr>
-          <w:p>
-            <w:pPr>
-              <w:rPr>
-                <w:rFonts w:asciiTheme="minorHAnsi" w:hAnsiTheme="minorHAnsi"/>
-                <w:sz w:val="20"/>
-                <w:szCs w:val="20"/>
-              </w:rPr>
-            </w:pPr>
-            <w:r>
-              <w:rPr>
-                <w:rFonts w:asciiTheme="minorHAnsi" w:hAnsiTheme="minorHAnsi"/>
-                <w:i/>
-                <w:iCs/>
-                <w:sz w:val="20"/>
-                <w:szCs w:val="20"/>
-              </w:rPr>
-              <w:t>Dec 7</w:t>
-            </w:r>
-          </w:p>
-        </w:tc>
-        <w:tc>
-          <w:tcPr>
-            <w:tcW w:w="1815" w:type="dxa"/>
-          </w:tcPr>
-          <w:p>
-            <w:pPr>
-              <w:rPr>
-                <w:rFonts w:asciiTheme="minorHAnsi" w:hAnsiTheme="minorHAnsi"/>
-                <w:sz w:val="20"/>
-                <w:szCs w:val="20"/>
-              </w:rPr>
-            </w:pPr>
-            <w:r>
-              <w:rPr>
-                <w:rFonts w:asciiTheme="minorHAnsi" w:hAnsiTheme="minorHAnsi"/>
-                <w:b/>
-                <w:bCs/>
-                <w:sz w:val="20"/>
-                <w:szCs w:val="20"/>
-              </w:rPr>
-              <w:t>Wrap-up</w:t>
-            </w:r>
-          </w:p>
-        </w:tc>
-        <w:tc>
-          <w:tcPr>
-            <w:tcW w:w="2005" w:type="dxa"/>
-            <w:shd w:val="clear" w:color="auto" w:fill="D9D9D9" w:themeFill="background1" w:themeFillShade="D9"/>
-          </w:tcPr>
-          <w:p>
-            <w:pPr>
-              <w:rPr>
-                <w:rFonts w:asciiTheme="minorHAnsi" w:hAnsiTheme="minorHAnsi"/>
-                <w:sz w:val="20"/>
-                <w:szCs w:val="20"/>
-              </w:rPr>
-            </w:pPr>
-            <w:r>
-              <w:rPr>
-                <w:rFonts w:asciiTheme="minorHAnsi" w:hAnsiTheme="minorHAnsi"/>
-                <w:sz w:val="20"/>
-                <w:szCs w:val="20"/>
-              </w:rPr>
-              <w:t>No class</w:t>
-            </w:r>
-          </w:p>
-        </w:tc>
-        <w:tc>
-          <w:tcPr>
-            <w:tcW w:w="2005" w:type="dxa"/>
-          </w:tcPr>
-          <w:p>
-            <w:pPr>
-              <w:rPr>
-                <w:sz w:val="20"/>
-                <w:szCs w:val="20"/>
-              </w:rPr>
-            </w:pPr>
-            <w:r>
-              <w:rPr>
-                <w:rFonts w:asciiTheme="minorHAnsi" w:hAnsiTheme="minorHAnsi"/>
-                <w:sz w:val="20"/>
-                <w:szCs w:val="20"/>
-              </w:rPr>
-              <w:t>___</w:t>
-            </w:r>
-          </w:p>
-        </w:tc>
-        <w:tc>
-          <w:tcPr>
-            <w:tcW w:w="2005" w:type="dxa"/>
-          </w:tcPr>
-          <w:p>
-            <w:pPr>
-              <w:rPr>
-                <w:sz w:val="20"/>
-                <w:szCs w:val="20"/>
-              </w:rPr>
-            </w:pPr>
-            <w:r>
-              <w:rPr>
-                <w:rFonts w:asciiTheme="minorHAnsi" w:hAnsiTheme="minorHAnsi"/>
-                <w:sz w:val="20"/>
-                <w:szCs w:val="20"/>
-              </w:rPr>
-              <w:t>____</w:t>
-            </w:r>
-          </w:p>
-        </w:tc>
-        <w:tc>
-          <w:tcPr>
-            <w:tcW w:w="1275" w:type="dxa"/>
-          </w:tcPr>
-          <w:p>
-            <w:pPr>
-              <w:rPr>
-                <w:rFonts w:asciiTheme="minorHAnsi" w:hAnsiTheme="minorHAnsi"/>
-                <w:sz w:val="20"/>
-                <w:szCs w:val="20"/>
-              </w:rPr>
-            </w:pPr>
-            <w:r>
-              <w:rPr>
-                <w:rFonts w:asciiTheme="minorHAnsi" w:hAnsiTheme="minorHAnsi"/>
-                <w:sz w:val="20"/>
-                <w:szCs w:val="20"/>
-              </w:rPr>
-              <w:t xml:space="preserve">P2 </w:t>
-            </w:r>
-            <w:r>
-              <w:rPr>
-                <w:rFonts w:asciiTheme="minorHAnsi" w:hAnsiTheme="minorHAnsi"/>
-                <w:sz w:val="20"/>
-                <w:szCs w:val="20"/>
-              </w:rPr>
-              <w:t>due</w:t>
+            <w:r>
+              <w:rPr>
+                <w:rFonts w:asciiTheme="minorHAnsi" w:hAnsiTheme="minorHAnsi"/>
+                <w:sz w:val="20"/>
+                <w:szCs w:val="20"/>
+              </w:rPr>
+              <w:t>P2 final piece due</w:t>
             </w:r>
           </w:p>
         </w:tc>
@@ -4347,7 +4217,7 @@
         <w:rPr>
           <w:rFonts w:asciiTheme="minorHAnsi" w:hAnsiTheme="minorHAnsi"/>
         </w:rPr>
-        <w:t xml:space="preserve">two individual projects designed to provide the </w:t>
+        <w:t xml:space="preserve">two projects designed to provide the </w:t>
       </w:r>
       <w:proofErr w:type="gramStart"/>
       <w:r>
@@ -4451,7 +4321,7 @@
           <w:b/>
           <w:bCs/>
         </w:rPr>
-        <w:t xml:space="preserve"> – Design and Build an </w:t>
+        <w:t xml:space="preserve"> – Interactive Notebook + </w:t>
       </w:r>
       <w:r>
         <w:rPr>
@@ -4473,52 +4343,10 @@
         <w:rPr>
           <w:rFonts w:asciiTheme="minorHAnsi" w:hAnsiTheme="minorHAnsi"/>
         </w:rPr>
-        <w:t xml:space="preserve"> For this project, you will build an </w:t>
-      </w:r>
-      <w:r>
-        <w:rPr>
-          <w:rFonts w:asciiTheme="minorHAnsi" w:hAnsiTheme="minorHAnsi"/>
-        </w:rPr>
-        <w:t>infographic</w:t>
-      </w:r>
-      <w:r>
-        <w:rPr>
-          <w:rFonts w:asciiTheme="minorHAnsi" w:hAnsiTheme="minorHAnsi"/>
-        </w:rPr>
-        <w:t xml:space="preserve"> </w:t>
-      </w:r>
-      <w:r>
-        <w:rPr>
-          <w:rFonts w:asciiTheme="minorHAnsi" w:hAnsiTheme="minorHAnsi"/>
-        </w:rPr>
-        <w:t>for a</w:t>
-      </w:r>
-      <w:r>
-        <w:rPr>
-          <w:rFonts w:asciiTheme="minorHAnsi" w:hAnsiTheme="minorHAnsi"/>
-        </w:rPr>
-        <w:t xml:space="preserve"> dataset of your own choosing. You will design and build your application using </w:t>
-      </w:r>
-      <w:r>
-        <w:rPr>
-          <w:rFonts w:asciiTheme="minorHAnsi" w:hAnsiTheme="minorHAnsi"/>
-        </w:rPr>
-        <w:t xml:space="preserve">matplotlib, seaborn, and/or </w:t>
+        <w:t xml:space="preserve"> For this project, your group will choose a dataset, explore it in an interactive Jupyter notebook built with Plotly and ipywidgets, and then distill your main finding into a standalone infographic (for a general audience) or science visualization (for a specialist audience). Each team will present their notebook and a draft of their final piece in class at the end of the semester, then revise the final piece based on feedback.</w:t>
       </w:r>
       <w:proofErr w:type="spellStart"/>
-      <w:r>
-        <w:rPr>
-          <w:rFonts w:asciiTheme="minorHAnsi" w:hAnsiTheme="minorHAnsi"/>
-        </w:rPr>
-        <w:t>Plotly</w:t>
-      </w:r>
       <w:proofErr w:type="spellEnd"/>
-      <w:r>
-        <w:rPr>
-          <w:rFonts w:asciiTheme="minorHAnsi" w:hAnsiTheme="minorHAnsi"/>
-        </w:rPr>
-        <w:t>. Each team will showcase their visualizations in a presentation during class at the end of the semester.</w:t>
-      </w:r>
     </w:p>
     <w:p>
       <w:pPr>
@@ -4907,31 +4735,7 @@
                 <w:sz w:val="20"/>
                 <w:szCs w:val="20"/>
               </w:rPr>
-              <w:t>P</w:t>
-            </w:r>
-            <w:r>
-              <w:rPr>
-                <w:rFonts w:asciiTheme="minorHAnsi" w:hAnsiTheme="minorHAnsi"/>
-                <w:sz w:val="20"/>
-                <w:szCs w:val="20"/>
-              </w:rPr>
-              <w:t>2</w:t>
-            </w:r>
-            <w:r>
-              <w:rPr>
-                <w:rFonts w:asciiTheme="minorHAnsi" w:hAnsiTheme="minorHAnsi"/>
-                <w:sz w:val="20"/>
-                <w:szCs w:val="20"/>
-              </w:rPr>
-              <w:t xml:space="preserve">: Design and Build an </w:t>
-            </w:r>
-            <w:r>
-              <w:rPr>
-                <w:rFonts w:asciiTheme="minorHAnsi" w:hAnsiTheme="minorHAnsi"/>
-                <w:sz w:val="20"/>
-                <w:szCs w:val="20"/>
-              </w:rPr>
-              <w:t>Infographic</w:t>
+              <w:t>P2: Interactive Notebook + Infographic/Science Visualization</w:t>
             </w:r>
           </w:p>
         </w:tc>

</xml_diff>

<commit_message>
Project 2: 200-point grading; notebook due with final piece
- Proposal 25, sketches + critique 25, presentation 50,
  final submission (notebook 50 + infographic/sci vis 50) 100
- Notebook moves to the Dec 7 final submission; only slides due Nov 29
- Critique focuses on the final piece, not the notebook

Co-Authored-By: Claude Opus 5.5 <noreply@anthropic.com>
</commit_message>
<xml_diff>
--- a/DS2003_Syllabus Fall 2026.docx
+++ b/DS2003_Syllabus Fall 2026.docx
@@ -3592,7 +3592,7 @@
                 <w:sz w:val="20"/>
                 <w:szCs w:val="20"/>
               </w:rPr>
-              <w:t>P2 notebook + slides due Sun 11/29</w:t>
+              <w:t>P2 slides due Sun 11/29</w:t>
             </w:r>
           </w:p>
         </w:tc>
@@ -3917,7 +3917,7 @@
                 <w:sz w:val="20"/>
                 <w:szCs w:val="20"/>
               </w:rPr>
-              <w:t>P2 final piece due</w:t>
+              <w:t>P2 final notebook + final piece due</w:t>
             </w:r>
           </w:p>
         </w:tc>

</xml_diff>

<commit_message>
Move data quality and ethics before the critique; work session 11/23
Co-Authored-By: Claude Opus 5.5 <noreply@anthropic.com>
</commit_message>
<xml_diff>
--- a/DS2003_Syllabus Fall 2026.docx
+++ b/DS2003_Syllabus Fall 2026.docx
@@ -3346,7 +3346,7 @@
                 <w:sz w:val="20"/>
                 <w:szCs w:val="20"/>
               </w:rPr>
-              <w:t>P2 work session</w:t>
+              <w:t>Data quality and deceptive plots</w:t>
             </w:r>
           </w:p>
         </w:tc>
@@ -3369,7 +3369,7 @@
                 <w:sz w:val="20"/>
                 <w:szCs w:val="20"/>
               </w:rPr>
-              <w:t>Data quality and deceptive plots</w:t>
+              <w:t>Ethics and rhetoric</w:t>
             </w:r>
           </w:p>
         </w:tc>
@@ -3494,7 +3494,7 @@
                 <w:sz w:val="20"/>
                 <w:szCs w:val="20"/>
               </w:rPr>
-              <w:t>Ethics</w:t>
+              <w:t>Project work</w:t>
             </w:r>
           </w:p>
         </w:tc>
@@ -3516,7 +3516,7 @@
                 <w:sz w:val="20"/>
                 <w:szCs w:val="20"/>
               </w:rPr>
-              <w:t>Ethics and rhetoric</w:t>
+              <w:t>P2 work session</w:t>
             </w:r>
           </w:p>
         </w:tc>

</xml_diff>

<commit_message>
Project 2: add narrative structure check-in; groups of 2-3
- New check-in due Nov 15 (25 pts): choose takeaway, track, audience,
  and narrative structure from notebook results
- Critique reflection due Nov 22; Lab 10 lightened
- Oct 19 P2 introduced, Oct 21 groups picked, proposal Oct 25

Co-Authored-By: Claude Opus 5.5 <noreply@anthropic.com>
</commit_message>
<xml_diff>
--- a/DS2003_Syllabus Fall 2026.docx
+++ b/DS2003_Syllabus Fall 2026.docx
@@ -2733,7 +2733,7 @@
                 <w:sz w:val="20"/>
                 <w:szCs w:val="20"/>
               </w:rPr>
-              <w:t>P2 assigned</w:t>
+              <w:t>P2 introduced</w:t>
             </w:r>
           </w:p>
           <w:p>
@@ -2750,7 +2750,24 @@
                 <w:sz w:val="20"/>
                 <w:szCs w:val="20"/>
               </w:rPr>
-              <w:t>P2 proposal due Sun</w:t>
+              <w:t>Groups (Wed)</w:t>
+            </w:r>
+          </w:p>
+          <w:p>
+            <w:pPr>
+              <w:rPr>
+                <w:rFonts w:asciiTheme="minorHAnsi" w:hAnsiTheme="minorHAnsi"/>
+                <w:sz w:val="20"/>
+                <w:szCs w:val="20"/>
+              </w:rPr>
+            </w:pPr>
+            <w:r>
+              <w:rPr>
+                <w:rFonts w:asciiTheme="minorHAnsi" w:hAnsiTheme="minorHAnsi"/>
+                <w:sz w:val="20"/>
+                <w:szCs w:val="20"/>
+              </w:rPr>
+              <w:t>Proposal (Sun)</w:t>
             </w:r>
           </w:p>
         </w:tc>
@@ -3229,7 +3246,7 @@
                 <w:sz w:val="20"/>
                 <w:szCs w:val="20"/>
               </w:rPr>
-              <w:t>Lab 10: Sketching and annotation</w:t>
+              <w:t>Lab 10 (light): Planning your final piece</w:t>
             </w:r>
           </w:p>
         </w:tc>
@@ -3241,7 +3258,540 @@
             <w:pPr>
               <w:rPr>
                 <w:rFonts w:asciiTheme="minorHAnsi" w:hAnsiTheme="minorHAnsi"/>
-                <w:color w:val="D9D9D9" w:themeColor="background1" w:themeShade="D9"/>
+                <w:sz w:val="20"/>
+                <w:szCs w:val="20"/>
+              </w:rPr>
+            </w:pPr>
+            <w:r>
+              <w:rPr>
+                <w:rFonts w:asciiTheme="minorHAnsi" w:hAnsiTheme="minorHAnsi"/>
+                <w:sz w:val="20"/>
+                <w:szCs w:val="20"/>
+              </w:rPr>
+              <w:t>P2 narrative (Sun)</w:t>
+            </w:r>
+          </w:p>
+        </w:tc>
+      </w:tr>
+      <w:tr>
+        <w:trPr>
+          <w:trHeight w:val="300"/>
+        </w:trPr>
+        <w:tc>
+          <w:tcPr>
+            <w:tcW w:w="555" w:type="dxa"/>
+          </w:tcPr>
+          <w:p>
+            <w:pPr>
+              <w:jc w:val="center"/>
+              <w:rPr>
+                <w:rFonts w:asciiTheme="minorHAnsi" w:hAnsiTheme="minorHAnsi"/>
+                <w:sz w:val="20"/>
+                <w:szCs w:val="20"/>
+              </w:rPr>
+            </w:pPr>
+            <w:r>
+              <w:rPr>
+                <w:rFonts w:asciiTheme="minorHAnsi" w:hAnsiTheme="minorHAnsi"/>
+                <w:b/>
+                <w:bCs/>
+                <w:sz w:val="20"/>
+                <w:szCs w:val="20"/>
+              </w:rPr>
+              <w:t>13</w:t>
+            </w:r>
+          </w:p>
+        </w:tc>
+        <w:tc>
+          <w:tcPr>
+            <w:tcW w:w="1140" w:type="dxa"/>
+          </w:tcPr>
+          <w:p>
+            <w:pPr>
+              <w:rPr>
+                <w:rFonts w:asciiTheme="minorHAnsi" w:hAnsiTheme="minorHAnsi"/>
+                <w:sz w:val="20"/>
+                <w:szCs w:val="20"/>
+              </w:rPr>
+            </w:pPr>
+            <w:r>
+              <w:rPr>
+                <w:rFonts w:asciiTheme="minorHAnsi" w:hAnsiTheme="minorHAnsi"/>
+                <w:i/>
+                <w:iCs/>
+                <w:sz w:val="20"/>
+                <w:szCs w:val="20"/>
+              </w:rPr>
+              <w:t>Nov 16 – 20</w:t>
+            </w:r>
+          </w:p>
+        </w:tc>
+        <w:tc>
+          <w:tcPr>
+            <w:tcW w:w="1815" w:type="dxa"/>
+          </w:tcPr>
+          <w:p>
+            <w:pPr>
+              <w:rPr>
+                <w:rFonts w:asciiTheme="minorHAnsi" w:hAnsiTheme="minorHAnsi"/>
+                <w:color w:val="BFBFBF" w:themeColor="background1" w:themeShade="BF"/>
+                <w:sz w:val="20"/>
+                <w:szCs w:val="20"/>
+              </w:rPr>
+            </w:pPr>
+            <w:r>
+              <w:rPr>
+                <w:rFonts w:asciiTheme="minorHAnsi" w:hAnsiTheme="minorHAnsi"/>
+                <w:b/>
+                <w:bCs/>
+                <w:sz w:val="20"/>
+                <w:szCs w:val="20"/>
+              </w:rPr>
+              <w:t>Lies, rhetoric &amp; critique</w:t>
+            </w:r>
+          </w:p>
+        </w:tc>
+        <w:tc>
+          <w:tcPr>
+            <w:tcW w:w="2005" w:type="dxa"/>
+          </w:tcPr>
+          <w:p>
+            <w:pPr>
+              <w:rPr>
+                <w:rFonts w:asciiTheme="minorHAnsi" w:hAnsiTheme="minorHAnsi"/>
+                <w:color w:val="BFBFBF" w:themeColor="background1" w:themeShade="BF"/>
+                <w:sz w:val="20"/>
+                <w:szCs w:val="20"/>
+              </w:rPr>
+            </w:pPr>
+            <w:r>
+              <w:rPr>
+                <w:rFonts w:asciiTheme="minorHAnsi" w:hAnsiTheme="minorHAnsi"/>
+                <w:sz w:val="20"/>
+                <w:szCs w:val="20"/>
+              </w:rPr>
+              <w:t>Data quality and deceptive plots</w:t>
+            </w:r>
+          </w:p>
+        </w:tc>
+        <w:tc>
+          <w:tcPr>
+            <w:tcW w:w="2005" w:type="dxa"/>
+          </w:tcPr>
+          <w:p>
+            <w:pPr>
+              <w:rPr>
+                <w:rFonts w:asciiTheme="minorHAnsi" w:hAnsiTheme="minorHAnsi"/>
+                <w:color w:val="BFBFBF" w:themeColor="background1" w:themeShade="BF"/>
+                <w:sz w:val="20"/>
+                <w:szCs w:val="20"/>
+              </w:rPr>
+            </w:pPr>
+            <w:r>
+              <w:rPr>
+                <w:rFonts w:asciiTheme="minorHAnsi" w:hAnsiTheme="minorHAnsi"/>
+                <w:sz w:val="20"/>
+                <w:szCs w:val="20"/>
+              </w:rPr>
+              <w:t>Ethics and rhetoric</w:t>
+            </w:r>
+          </w:p>
+        </w:tc>
+        <w:tc>
+          <w:tcPr>
+            <w:tcW w:w="2005" w:type="dxa"/>
+          </w:tcPr>
+          <w:p>
+            <w:pPr>
+              <w:rPr>
+                <w:rFonts w:asciiTheme="minorHAnsi" w:hAnsiTheme="minorHAnsi"/>
+                <w:color w:val="BFBFBF" w:themeColor="background1" w:themeShade="BF"/>
+                <w:sz w:val="20"/>
+                <w:szCs w:val="20"/>
+              </w:rPr>
+            </w:pPr>
+            <w:r>
+              <w:rPr>
+                <w:rFonts w:asciiTheme="minorHAnsi" w:hAnsiTheme="minorHAnsi"/>
+                <w:sz w:val="20"/>
+                <w:szCs w:val="20"/>
+              </w:rPr>
+              <w:t>P2 design critique</w:t>
+            </w:r>
+          </w:p>
+        </w:tc>
+        <w:tc>
+          <w:tcPr>
+            <w:tcW w:w="1275" w:type="dxa"/>
+          </w:tcPr>
+          <w:p>
+            <w:pPr>
+              <w:rPr>
+                <w:rFonts w:asciiTheme="minorHAnsi" w:hAnsiTheme="minorHAnsi"/>
+                <w:sz w:val="20"/>
+                <w:szCs w:val="20"/>
+              </w:rPr>
+            </w:pPr>
+            <w:r>
+              <w:rPr>
+                <w:rFonts w:asciiTheme="minorHAnsi" w:hAnsiTheme="minorHAnsi"/>
+                <w:sz w:val="20"/>
+                <w:szCs w:val="20"/>
+              </w:rPr>
+              <w:t>P2 sketches</w:t>
+            </w:r>
+          </w:p>
+          <w:p>
+            <w:pPr>
+              <w:rPr>
+                <w:rFonts w:asciiTheme="minorHAnsi" w:hAnsiTheme="minorHAnsi"/>
+                <w:sz w:val="20"/>
+                <w:szCs w:val="20"/>
+              </w:rPr>
+            </w:pPr>
+            <w:r>
+              <w:rPr>
+                <w:rFonts w:asciiTheme="minorHAnsi" w:hAnsiTheme="minorHAnsi"/>
+                <w:sz w:val="20"/>
+                <w:szCs w:val="20"/>
+              </w:rPr>
+              <w:t>Reflection (Sun)</w:t>
+            </w:r>
+          </w:p>
+        </w:tc>
+      </w:tr>
+      <w:tr>
+        <w:trPr>
+          <w:trHeight w:val="300"/>
+        </w:trPr>
+        <w:tc>
+          <w:tcPr>
+            <w:tcW w:w="555" w:type="dxa"/>
+          </w:tcPr>
+          <w:p>
+            <w:pPr>
+              <w:jc w:val="center"/>
+              <w:rPr>
+                <w:rFonts w:asciiTheme="minorHAnsi" w:hAnsiTheme="minorHAnsi"/>
+                <w:sz w:val="20"/>
+                <w:szCs w:val="20"/>
+              </w:rPr>
+            </w:pPr>
+            <w:r>
+              <w:rPr>
+                <w:rFonts w:asciiTheme="minorHAnsi" w:hAnsiTheme="minorHAnsi"/>
+                <w:b/>
+                <w:bCs/>
+                <w:sz w:val="20"/>
+                <w:szCs w:val="20"/>
+              </w:rPr>
+              <w:t>14</w:t>
+            </w:r>
+          </w:p>
+        </w:tc>
+        <w:tc>
+          <w:tcPr>
+            <w:tcW w:w="1140" w:type="dxa"/>
+          </w:tcPr>
+          <w:p>
+            <w:pPr>
+              <w:rPr>
+                <w:rFonts w:asciiTheme="minorHAnsi" w:hAnsiTheme="minorHAnsi"/>
+                <w:sz w:val="20"/>
+                <w:szCs w:val="20"/>
+              </w:rPr>
+            </w:pPr>
+            <w:r>
+              <w:rPr>
+                <w:rFonts w:asciiTheme="minorHAnsi" w:hAnsiTheme="minorHAnsi"/>
+                <w:i/>
+                <w:iCs/>
+                <w:sz w:val="20"/>
+                <w:szCs w:val="20"/>
+              </w:rPr>
+              <w:t>Nov 23</w:t>
+            </w:r>
+          </w:p>
+        </w:tc>
+        <w:tc>
+          <w:tcPr>
+            <w:tcW w:w="1815" w:type="dxa"/>
+          </w:tcPr>
+          <w:p>
+            <w:pPr>
+              <w:rPr>
+                <w:rFonts w:asciiTheme="minorHAnsi" w:hAnsiTheme="minorHAnsi"/>
+                <w:b/>
+                <w:bCs/>
+                <w:sz w:val="20"/>
+                <w:szCs w:val="20"/>
+              </w:rPr>
+            </w:pPr>
+            <w:r>
+              <w:rPr>
+                <w:rFonts w:asciiTheme="minorHAnsi" w:hAnsiTheme="minorHAnsi"/>
+                <w:b/>
+                <w:bCs/>
+                <w:sz w:val="20"/>
+                <w:szCs w:val="20"/>
+              </w:rPr>
+              <w:t>Project work</w:t>
+            </w:r>
+          </w:p>
+        </w:tc>
+        <w:tc>
+          <w:tcPr>
+            <w:tcW w:w="2005" w:type="dxa"/>
+          </w:tcPr>
+          <w:p>
+            <w:pPr>
+              <w:rPr>
+                <w:rFonts w:asciiTheme="minorHAnsi" w:hAnsiTheme="minorHAnsi"/>
+                <w:sz w:val="20"/>
+                <w:szCs w:val="20"/>
+              </w:rPr>
+            </w:pPr>
+            <w:r>
+              <w:rPr>
+                <w:rFonts w:asciiTheme="minorHAnsi" w:hAnsiTheme="minorHAnsi"/>
+                <w:sz w:val="20"/>
+                <w:szCs w:val="20"/>
+              </w:rPr>
+              <w:t>P2 work session</w:t>
+            </w:r>
+          </w:p>
+        </w:tc>
+        <w:tc>
+          <w:tcPr>
+            <w:tcW w:w="2005" w:type="dxa"/>
+            <w:shd w:val="clear" w:color="auto" w:fill="D9D9D9" w:themeFill="background1" w:themeFillShade="D9"/>
+          </w:tcPr>
+          <w:p>
+            <w:pPr>
+              <w:rPr>
+                <w:rFonts w:asciiTheme="minorHAnsi" w:hAnsiTheme="minorHAnsi"/>
+                <w:sz w:val="20"/>
+                <w:szCs w:val="20"/>
+              </w:rPr>
+            </w:pPr>
+            <w:r>
+              <w:rPr>
+                <w:rFonts w:asciiTheme="minorHAnsi" w:hAnsiTheme="minorHAnsi"/>
+                <w:sz w:val="20"/>
+                <w:szCs w:val="20"/>
+              </w:rPr>
+              <w:t xml:space="preserve">No Class </w:t>
+            </w:r>
+            <w:r>
+              <w:rPr>
+                <w:rFonts w:asciiTheme="minorHAnsi" w:hAnsiTheme="minorHAnsi"/>
+                <w:sz w:val="20"/>
+                <w:szCs w:val="20"/>
+              </w:rPr>
+              <w:t>(Thanksgiving)</w:t>
+            </w:r>
+          </w:p>
+        </w:tc>
+        <w:tc>
+          <w:tcPr>
+            <w:tcW w:w="2005" w:type="dxa"/>
+            <w:shd w:val="clear" w:color="auto" w:fill="D9D9D9" w:themeFill="background1" w:themeFillShade="D9"/>
+          </w:tcPr>
+          <w:p>
+            <w:pPr>
+              <w:rPr>
+                <w:rFonts w:asciiTheme="minorHAnsi" w:hAnsiTheme="minorHAnsi"/>
+                <w:sz w:val="20"/>
+                <w:szCs w:val="20"/>
+              </w:rPr>
+            </w:pPr>
+            <w:r>
+              <w:rPr>
+                <w:rFonts w:asciiTheme="minorHAnsi" w:hAnsiTheme="minorHAnsi"/>
+                <w:sz w:val="20"/>
+                <w:szCs w:val="20"/>
+              </w:rPr>
+              <w:t>No Class (Thanksgiving)</w:t>
+            </w:r>
+          </w:p>
+        </w:tc>
+        <w:tc>
+          <w:tcPr>
+            <w:tcW w:w="1275" w:type="dxa"/>
+          </w:tcPr>
+          <w:p>
+            <w:pPr>
+              <w:rPr>
+                <w:rFonts w:asciiTheme="minorHAnsi" w:hAnsiTheme="minorHAnsi"/>
+                <w:sz w:val="20"/>
+                <w:szCs w:val="20"/>
+              </w:rPr>
+            </w:pPr>
+            <w:r>
+              <w:rPr>
+                <w:rFonts w:asciiTheme="minorHAnsi" w:hAnsiTheme="minorHAnsi"/>
+                <w:sz w:val="20"/>
+                <w:szCs w:val="20"/>
+              </w:rPr>
+              <w:t>P2 slides (Sun)</w:t>
+            </w:r>
+          </w:p>
+        </w:tc>
+      </w:tr>
+      <w:tr>
+        <w:trPr>
+          <w:trHeight w:val="300"/>
+        </w:trPr>
+        <w:tc>
+          <w:tcPr>
+            <w:tcW w:w="555" w:type="dxa"/>
+          </w:tcPr>
+          <w:p>
+            <w:pPr>
+              <w:jc w:val="center"/>
+              <w:rPr>
+                <w:rFonts w:asciiTheme="minorHAnsi" w:hAnsiTheme="minorHAnsi"/>
+                <w:sz w:val="20"/>
+                <w:szCs w:val="20"/>
+              </w:rPr>
+            </w:pPr>
+            <w:r>
+              <w:rPr>
+                <w:rFonts w:asciiTheme="minorHAnsi" w:hAnsiTheme="minorHAnsi"/>
+                <w:b/>
+                <w:bCs/>
+                <w:sz w:val="20"/>
+                <w:szCs w:val="20"/>
+              </w:rPr>
+              <w:t>15</w:t>
+            </w:r>
+          </w:p>
+        </w:tc>
+        <w:tc>
+          <w:tcPr>
+            <w:tcW w:w="1140" w:type="dxa"/>
+          </w:tcPr>
+          <w:p>
+            <w:pPr>
+              <w:rPr>
+                <w:rFonts w:asciiTheme="minorHAnsi" w:hAnsiTheme="minorHAnsi"/>
+                <w:sz w:val="20"/>
+                <w:szCs w:val="20"/>
+              </w:rPr>
+            </w:pPr>
+            <w:r>
+              <w:rPr>
+                <w:rFonts w:asciiTheme="minorHAnsi" w:hAnsiTheme="minorHAnsi"/>
+                <w:i/>
+                <w:iCs/>
+                <w:sz w:val="20"/>
+                <w:szCs w:val="20"/>
+              </w:rPr>
+              <w:t>Nov 30 – Dec 4</w:t>
+            </w:r>
+          </w:p>
+        </w:tc>
+        <w:tc>
+          <w:tcPr>
+            <w:tcW w:w="1815" w:type="dxa"/>
+          </w:tcPr>
+          <w:p>
+            <w:pPr>
+              <w:rPr>
+                <w:rFonts w:asciiTheme="minorHAnsi" w:hAnsiTheme="minorHAnsi"/>
+                <w:sz w:val="20"/>
+                <w:szCs w:val="20"/>
+              </w:rPr>
+            </w:pPr>
+            <w:r>
+              <w:rPr>
+                <w:rFonts w:asciiTheme="minorHAnsi" w:hAnsiTheme="minorHAnsi"/>
+                <w:b/>
+                <w:bCs/>
+                <w:sz w:val="20"/>
+                <w:szCs w:val="20"/>
+              </w:rPr>
+              <w:t>Final Presentations</w:t>
+            </w:r>
+          </w:p>
+        </w:tc>
+        <w:tc>
+          <w:tcPr>
+            <w:tcW w:w="2005" w:type="dxa"/>
+            <w:shd w:val="clear" w:color="auto" w:fill="CAEDFB" w:themeFill="accent4" w:themeFillTint="33"/>
+          </w:tcPr>
+          <w:p>
+            <w:pPr>
+              <w:rPr>
+                <w:rFonts w:asciiTheme="minorHAnsi" w:hAnsiTheme="minorHAnsi"/>
+                <w:sz w:val="20"/>
+                <w:szCs w:val="20"/>
+              </w:rPr>
+            </w:pPr>
+            <w:r>
+              <w:rPr>
+                <w:rFonts w:asciiTheme="minorHAnsi" w:hAnsiTheme="minorHAnsi"/>
+                <w:sz w:val="20"/>
+                <w:szCs w:val="20"/>
+              </w:rPr>
+              <w:t>Project Presentations (Day 1)</w:t>
+            </w:r>
+          </w:p>
+        </w:tc>
+        <w:tc>
+          <w:tcPr>
+            <w:tcW w:w="2005" w:type="dxa"/>
+            <w:shd w:val="clear" w:color="auto" w:fill="CAEDFB" w:themeFill="accent4" w:themeFillTint="33"/>
+          </w:tcPr>
+          <w:p>
+            <w:pPr>
+              <w:rPr>
+                <w:rFonts w:asciiTheme="minorHAnsi" w:hAnsiTheme="minorHAnsi"/>
+                <w:sz w:val="20"/>
+                <w:szCs w:val="20"/>
+              </w:rPr>
+            </w:pPr>
+            <w:r>
+              <w:rPr>
+                <w:rFonts w:asciiTheme="minorHAnsi" w:hAnsiTheme="minorHAnsi"/>
+                <w:sz w:val="20"/>
+                <w:szCs w:val="20"/>
+              </w:rPr>
+              <w:t>Project Presentations (Day 2)</w:t>
+            </w:r>
+          </w:p>
+        </w:tc>
+        <w:tc>
+          <w:tcPr>
+            <w:tcW w:w="2005" w:type="dxa"/>
+            <w:shd w:val="clear" w:color="auto" w:fill="CAEDFB" w:themeFill="accent4" w:themeFillTint="33"/>
+          </w:tcPr>
+          <w:p>
+            <w:pPr>
+              <w:rPr>
+                <w:rFonts w:asciiTheme="minorHAnsi" w:hAnsiTheme="minorHAnsi"/>
+                <w:sz w:val="20"/>
+                <w:szCs w:val="20"/>
+              </w:rPr>
+            </w:pPr>
+            <w:r>
+              <w:rPr>
+                <w:rFonts w:asciiTheme="minorHAnsi" w:hAnsiTheme="minorHAnsi"/>
+                <w:sz w:val="20"/>
+                <w:szCs w:val="20"/>
+              </w:rPr>
+              <w:t>Project Presentations (Day 3)</w:t>
+            </w:r>
+          </w:p>
+        </w:tc>
+        <w:tc>
+          <w:tcPr>
+            <w:tcW w:w="1275" w:type="dxa"/>
+          </w:tcPr>
+          <w:p>
+            <w:pPr>
+              <w:rPr>
+                <w:rFonts w:asciiTheme="minorHAnsi" w:hAnsiTheme="minorHAnsi"/>
                 <w:sz w:val="20"/>
                 <w:szCs w:val="20"/>
               </w:rPr>
@@ -3274,7 +3824,7 @@
                 <w:sz w:val="20"/>
                 <w:szCs w:val="20"/>
               </w:rPr>
-              <w:t>13</w:t>
+              <w:t>16</w:t>
             </w:r>
           </w:p>
         </w:tc>
@@ -3298,7 +3848,7 @@
                 <w:sz w:val="20"/>
                 <w:szCs w:val="20"/>
               </w:rPr>
-              <w:t>Nov 16 – 20</w:t>
+              <w:t>Dec 7</w:t>
             </w:r>
           </w:p>
         </w:tc>
@@ -3310,7 +3860,6 @@
             <w:pPr>
               <w:rPr>
                 <w:rFonts w:asciiTheme="minorHAnsi" w:hAnsiTheme="minorHAnsi"/>
-                <w:color w:val="BFBFBF" w:themeColor="background1" w:themeShade="BF"/>
                 <w:sz w:val="20"/>
                 <w:szCs w:val="20"/>
               </w:rPr>
@@ -3323,7 +3872,7 @@
                 <w:sz w:val="20"/>
                 <w:szCs w:val="20"/>
               </w:rPr>
-              <w:t>Lies, rhetoric &amp; critique</w:t>
+              <w:t>Wrap-up</w:t>
             </w:r>
           </w:p>
         </w:tc>
@@ -3335,7 +3884,6 @@
             <w:pPr>
               <w:rPr>
                 <w:rFonts w:asciiTheme="minorHAnsi" w:hAnsiTheme="minorHAnsi"/>
-                <w:color w:val="BFBFBF" w:themeColor="background1" w:themeShade="BF"/>
                 <w:sz w:val="20"/>
                 <w:szCs w:val="20"/>
               </w:rPr>
@@ -3346,7 +3894,7 @@
                 <w:sz w:val="20"/>
                 <w:szCs w:val="20"/>
               </w:rPr>
-              <w:t>Data quality and deceptive plots</w:t>
+              <w:t>Last class: Worst Chart Contest</w:t>
             </w:r>
           </w:p>
         </w:tc>
@@ -3357,8 +3905,6 @@
           <w:p>
             <w:pPr>
               <w:rPr>
-                <w:rFonts w:asciiTheme="minorHAnsi" w:hAnsiTheme="minorHAnsi"/>
-                <w:color w:val="BFBFBF" w:themeColor="background1" w:themeShade="BF"/>
                 <w:sz w:val="20"/>
                 <w:szCs w:val="20"/>
               </w:rPr>
@@ -3369,7 +3915,7 @@
                 <w:sz w:val="20"/>
                 <w:szCs w:val="20"/>
               </w:rPr>
-              <w:t>Ethics and rhetoric</w:t>
+              <w:t>___</w:t>
             </w:r>
           </w:p>
         </w:tc>
@@ -3380,8 +3926,6 @@
           <w:p>
             <w:pPr>
               <w:rPr>
-                <w:rFonts w:asciiTheme="minorHAnsi" w:hAnsiTheme="minorHAnsi"/>
-                <w:color w:val="BFBFBF" w:themeColor="background1" w:themeShade="BF"/>
                 <w:sz w:val="20"/>
                 <w:szCs w:val="20"/>
               </w:rPr>
@@ -3392,7 +3936,7 @@
                 <w:sz w:val="20"/>
                 <w:szCs w:val="20"/>
               </w:rPr>
-              <w:t>P2 design critique</w:t>
+              <w:t>____</w:t>
             </w:r>
           </w:p>
         </w:tc>
@@ -3414,510 +3958,7 @@
                 <w:sz w:val="20"/>
                 <w:szCs w:val="20"/>
               </w:rPr>
-              <w:t>P2 final-piece sketches</w:t>
-            </w:r>
-          </w:p>
-        </w:tc>
-      </w:tr>
-      <w:tr>
-        <w:trPr>
-          <w:trHeight w:val="300"/>
-        </w:trPr>
-        <w:tc>
-          <w:tcPr>
-            <w:tcW w:w="555" w:type="dxa"/>
-          </w:tcPr>
-          <w:p>
-            <w:pPr>
-              <w:jc w:val="center"/>
-              <w:rPr>
-                <w:rFonts w:asciiTheme="minorHAnsi" w:hAnsiTheme="minorHAnsi"/>
-                <w:sz w:val="20"/>
-                <w:szCs w:val="20"/>
-              </w:rPr>
-            </w:pPr>
-            <w:r>
-              <w:rPr>
-                <w:rFonts w:asciiTheme="minorHAnsi" w:hAnsiTheme="minorHAnsi"/>
-                <w:b/>
-                <w:bCs/>
-                <w:sz w:val="20"/>
-                <w:szCs w:val="20"/>
-              </w:rPr>
-              <w:t>14</w:t>
-            </w:r>
-          </w:p>
-        </w:tc>
-        <w:tc>
-          <w:tcPr>
-            <w:tcW w:w="1140" w:type="dxa"/>
-          </w:tcPr>
-          <w:p>
-            <w:pPr>
-              <w:rPr>
-                <w:rFonts w:asciiTheme="minorHAnsi" w:hAnsiTheme="minorHAnsi"/>
-                <w:sz w:val="20"/>
-                <w:szCs w:val="20"/>
-              </w:rPr>
-            </w:pPr>
-            <w:r>
-              <w:rPr>
-                <w:rFonts w:asciiTheme="minorHAnsi" w:hAnsiTheme="minorHAnsi"/>
-                <w:i/>
-                <w:iCs/>
-                <w:sz w:val="20"/>
-                <w:szCs w:val="20"/>
-              </w:rPr>
-              <w:t>Nov 23</w:t>
-            </w:r>
-          </w:p>
-        </w:tc>
-        <w:tc>
-          <w:tcPr>
-            <w:tcW w:w="1815" w:type="dxa"/>
-          </w:tcPr>
-          <w:p>
-            <w:pPr>
-              <w:rPr>
-                <w:rFonts w:asciiTheme="minorHAnsi" w:hAnsiTheme="minorHAnsi"/>
-                <w:b/>
-                <w:bCs/>
-                <w:sz w:val="20"/>
-                <w:szCs w:val="20"/>
-              </w:rPr>
-            </w:pPr>
-            <w:r>
-              <w:rPr>
-                <w:rFonts w:asciiTheme="minorHAnsi" w:hAnsiTheme="minorHAnsi"/>
-                <w:b/>
-                <w:bCs/>
-                <w:sz w:val="20"/>
-                <w:szCs w:val="20"/>
-              </w:rPr>
-              <w:t>Project work</w:t>
-            </w:r>
-          </w:p>
-        </w:tc>
-        <w:tc>
-          <w:tcPr>
-            <w:tcW w:w="2005" w:type="dxa"/>
-          </w:tcPr>
-          <w:p>
-            <w:pPr>
-              <w:rPr>
-                <w:rFonts w:asciiTheme="minorHAnsi" w:hAnsiTheme="minorHAnsi"/>
-                <w:sz w:val="20"/>
-                <w:szCs w:val="20"/>
-              </w:rPr>
-            </w:pPr>
-            <w:r>
-              <w:rPr>
-                <w:rFonts w:asciiTheme="minorHAnsi" w:hAnsiTheme="minorHAnsi"/>
-                <w:sz w:val="20"/>
-                <w:szCs w:val="20"/>
-              </w:rPr>
-              <w:t>P2 work session</w:t>
-            </w:r>
-          </w:p>
-        </w:tc>
-        <w:tc>
-          <w:tcPr>
-            <w:tcW w:w="2005" w:type="dxa"/>
-            <w:shd w:val="clear" w:color="auto" w:fill="D9D9D9" w:themeFill="background1" w:themeFillShade="D9"/>
-          </w:tcPr>
-          <w:p>
-            <w:pPr>
-              <w:rPr>
-                <w:rFonts w:asciiTheme="minorHAnsi" w:hAnsiTheme="minorHAnsi"/>
-                <w:sz w:val="20"/>
-                <w:szCs w:val="20"/>
-              </w:rPr>
-            </w:pPr>
-            <w:r>
-              <w:rPr>
-                <w:rFonts w:asciiTheme="minorHAnsi" w:hAnsiTheme="minorHAnsi"/>
-                <w:sz w:val="20"/>
-                <w:szCs w:val="20"/>
-              </w:rPr>
-              <w:t xml:space="preserve">No Class </w:t>
-            </w:r>
-            <w:r>
-              <w:rPr>
-                <w:rFonts w:asciiTheme="minorHAnsi" w:hAnsiTheme="minorHAnsi"/>
-                <w:sz w:val="20"/>
-                <w:szCs w:val="20"/>
-              </w:rPr>
-              <w:t>(Thanksgiving)</w:t>
-            </w:r>
-          </w:p>
-        </w:tc>
-        <w:tc>
-          <w:tcPr>
-            <w:tcW w:w="2005" w:type="dxa"/>
-            <w:shd w:val="clear" w:color="auto" w:fill="D9D9D9" w:themeFill="background1" w:themeFillShade="D9"/>
-          </w:tcPr>
-          <w:p>
-            <w:pPr>
-              <w:rPr>
-                <w:rFonts w:asciiTheme="minorHAnsi" w:hAnsiTheme="minorHAnsi"/>
-                <w:sz w:val="20"/>
-                <w:szCs w:val="20"/>
-              </w:rPr>
-            </w:pPr>
-            <w:r>
-              <w:rPr>
-                <w:rFonts w:asciiTheme="minorHAnsi" w:hAnsiTheme="minorHAnsi"/>
-                <w:sz w:val="20"/>
-                <w:szCs w:val="20"/>
-              </w:rPr>
-              <w:t>No Class (Thanksgiving)</w:t>
-            </w:r>
-          </w:p>
-        </w:tc>
-        <w:tc>
-          <w:tcPr>
-            <w:tcW w:w="1275" w:type="dxa"/>
-          </w:tcPr>
-          <w:p>
-            <w:pPr>
-              <w:rPr>
-                <w:rFonts w:asciiTheme="minorHAnsi" w:hAnsiTheme="minorHAnsi"/>
-                <w:sz w:val="20"/>
-                <w:szCs w:val="20"/>
-              </w:rPr>
-            </w:pPr>
-            <w:r>
-              <w:rPr>
-                <w:rFonts w:asciiTheme="minorHAnsi" w:hAnsiTheme="minorHAnsi"/>
-                <w:sz w:val="20"/>
-                <w:szCs w:val="20"/>
-              </w:rPr>
-              <w:t>P2 slides due Sun 11/29</w:t>
-            </w:r>
-          </w:p>
-        </w:tc>
-      </w:tr>
-      <w:tr>
-        <w:trPr>
-          <w:trHeight w:val="300"/>
-        </w:trPr>
-        <w:tc>
-          <w:tcPr>
-            <w:tcW w:w="555" w:type="dxa"/>
-          </w:tcPr>
-          <w:p>
-            <w:pPr>
-              <w:jc w:val="center"/>
-              <w:rPr>
-                <w:rFonts w:asciiTheme="minorHAnsi" w:hAnsiTheme="minorHAnsi"/>
-                <w:sz w:val="20"/>
-                <w:szCs w:val="20"/>
-              </w:rPr>
-            </w:pPr>
-            <w:r>
-              <w:rPr>
-                <w:rFonts w:asciiTheme="minorHAnsi" w:hAnsiTheme="minorHAnsi"/>
-                <w:b/>
-                <w:bCs/>
-                <w:sz w:val="20"/>
-                <w:szCs w:val="20"/>
-              </w:rPr>
-              <w:t>15</w:t>
-            </w:r>
-          </w:p>
-        </w:tc>
-        <w:tc>
-          <w:tcPr>
-            <w:tcW w:w="1140" w:type="dxa"/>
-          </w:tcPr>
-          <w:p>
-            <w:pPr>
-              <w:rPr>
-                <w:rFonts w:asciiTheme="minorHAnsi" w:hAnsiTheme="minorHAnsi"/>
-                <w:sz w:val="20"/>
-                <w:szCs w:val="20"/>
-              </w:rPr>
-            </w:pPr>
-            <w:r>
-              <w:rPr>
-                <w:rFonts w:asciiTheme="minorHAnsi" w:hAnsiTheme="minorHAnsi"/>
-                <w:i/>
-                <w:iCs/>
-                <w:sz w:val="20"/>
-                <w:szCs w:val="20"/>
-              </w:rPr>
-              <w:t>Nov 30 – Dec 4</w:t>
-            </w:r>
-          </w:p>
-        </w:tc>
-        <w:tc>
-          <w:tcPr>
-            <w:tcW w:w="1815" w:type="dxa"/>
-          </w:tcPr>
-          <w:p>
-            <w:pPr>
-              <w:rPr>
-                <w:rFonts w:asciiTheme="minorHAnsi" w:hAnsiTheme="minorHAnsi"/>
-                <w:sz w:val="20"/>
-                <w:szCs w:val="20"/>
-              </w:rPr>
-            </w:pPr>
-            <w:r>
-              <w:rPr>
-                <w:rFonts w:asciiTheme="minorHAnsi" w:hAnsiTheme="minorHAnsi"/>
-                <w:b/>
-                <w:bCs/>
-                <w:sz w:val="20"/>
-                <w:szCs w:val="20"/>
-              </w:rPr>
-              <w:t>Final Presentations</w:t>
-            </w:r>
-          </w:p>
-        </w:tc>
-        <w:tc>
-          <w:tcPr>
-            <w:tcW w:w="2005" w:type="dxa"/>
-            <w:shd w:val="clear" w:color="auto" w:fill="CAEDFB" w:themeFill="accent4" w:themeFillTint="33"/>
-          </w:tcPr>
-          <w:p>
-            <w:pPr>
-              <w:rPr>
-                <w:rFonts w:asciiTheme="minorHAnsi" w:hAnsiTheme="minorHAnsi"/>
-                <w:sz w:val="20"/>
-                <w:szCs w:val="20"/>
-              </w:rPr>
-            </w:pPr>
-            <w:r>
-              <w:rPr>
-                <w:rFonts w:asciiTheme="minorHAnsi" w:hAnsiTheme="minorHAnsi"/>
-                <w:sz w:val="20"/>
-                <w:szCs w:val="20"/>
-              </w:rPr>
-              <w:t>Project Presentations (Day 1)</w:t>
-            </w:r>
-          </w:p>
-        </w:tc>
-        <w:tc>
-          <w:tcPr>
-            <w:tcW w:w="2005" w:type="dxa"/>
-            <w:shd w:val="clear" w:color="auto" w:fill="CAEDFB" w:themeFill="accent4" w:themeFillTint="33"/>
-          </w:tcPr>
-          <w:p>
-            <w:pPr>
-              <w:rPr>
-                <w:rFonts w:asciiTheme="minorHAnsi" w:hAnsiTheme="minorHAnsi"/>
-                <w:sz w:val="20"/>
-                <w:szCs w:val="20"/>
-              </w:rPr>
-            </w:pPr>
-            <w:r>
-              <w:rPr>
-                <w:rFonts w:asciiTheme="minorHAnsi" w:hAnsiTheme="minorHAnsi"/>
-                <w:sz w:val="20"/>
-                <w:szCs w:val="20"/>
-              </w:rPr>
-              <w:t>Project Presentations (Day 2)</w:t>
-            </w:r>
-          </w:p>
-        </w:tc>
-        <w:tc>
-          <w:tcPr>
-            <w:tcW w:w="2005" w:type="dxa"/>
-            <w:shd w:val="clear" w:color="auto" w:fill="CAEDFB" w:themeFill="accent4" w:themeFillTint="33"/>
-          </w:tcPr>
-          <w:p>
-            <w:pPr>
-              <w:rPr>
-                <w:rFonts w:asciiTheme="minorHAnsi" w:hAnsiTheme="minorHAnsi"/>
-                <w:sz w:val="20"/>
-                <w:szCs w:val="20"/>
-              </w:rPr>
-            </w:pPr>
-            <w:r>
-              <w:rPr>
-                <w:rFonts w:asciiTheme="minorHAnsi" w:hAnsiTheme="minorHAnsi"/>
-                <w:sz w:val="20"/>
-                <w:szCs w:val="20"/>
-              </w:rPr>
-              <w:t>Project Presentations (Day 3)</w:t>
-            </w:r>
-          </w:p>
-        </w:tc>
-        <w:tc>
-          <w:tcPr>
-            <w:tcW w:w="1275" w:type="dxa"/>
-          </w:tcPr>
-          <w:p>
-            <w:pPr>
-              <w:rPr>
-                <w:rFonts w:asciiTheme="minorHAnsi" w:hAnsiTheme="minorHAnsi"/>
-                <w:sz w:val="20"/>
-                <w:szCs w:val="20"/>
-              </w:rPr>
-            </w:pPr>
-          </w:p>
-        </w:tc>
-      </w:tr>
-      <w:tr>
-        <w:trPr>
-          <w:trHeight w:val="300"/>
-        </w:trPr>
-        <w:tc>
-          <w:tcPr>
-            <w:tcW w:w="555" w:type="dxa"/>
-          </w:tcPr>
-          <w:p>
-            <w:pPr>
-              <w:jc w:val="center"/>
-              <w:rPr>
-                <w:rFonts w:asciiTheme="minorHAnsi" w:hAnsiTheme="minorHAnsi"/>
-                <w:sz w:val="20"/>
-                <w:szCs w:val="20"/>
-              </w:rPr>
-            </w:pPr>
-            <w:r>
-              <w:rPr>
-                <w:rFonts w:asciiTheme="minorHAnsi" w:hAnsiTheme="minorHAnsi"/>
-                <w:b/>
-                <w:bCs/>
-                <w:sz w:val="20"/>
-                <w:szCs w:val="20"/>
-              </w:rPr>
-              <w:t>16</w:t>
-            </w:r>
-          </w:p>
-        </w:tc>
-        <w:tc>
-          <w:tcPr>
-            <w:tcW w:w="1140" w:type="dxa"/>
-          </w:tcPr>
-          <w:p>
-            <w:pPr>
-              <w:rPr>
-                <w:rFonts w:asciiTheme="minorHAnsi" w:hAnsiTheme="minorHAnsi"/>
-                <w:sz w:val="20"/>
-                <w:szCs w:val="20"/>
-              </w:rPr>
-            </w:pPr>
-            <w:r>
-              <w:rPr>
-                <w:rFonts w:asciiTheme="minorHAnsi" w:hAnsiTheme="minorHAnsi"/>
-                <w:i/>
-                <w:iCs/>
-                <w:sz w:val="20"/>
-                <w:szCs w:val="20"/>
-              </w:rPr>
-              <w:t>Dec 7</w:t>
-            </w:r>
-          </w:p>
-        </w:tc>
-        <w:tc>
-          <w:tcPr>
-            <w:tcW w:w="1815" w:type="dxa"/>
-          </w:tcPr>
-          <w:p>
-            <w:pPr>
-              <w:rPr>
-                <w:rFonts w:asciiTheme="minorHAnsi" w:hAnsiTheme="minorHAnsi"/>
-                <w:sz w:val="20"/>
-                <w:szCs w:val="20"/>
-              </w:rPr>
-            </w:pPr>
-            <w:r>
-              <w:rPr>
-                <w:rFonts w:asciiTheme="minorHAnsi" w:hAnsiTheme="minorHAnsi"/>
-                <w:b/>
-                <w:bCs/>
-                <w:sz w:val="20"/>
-                <w:szCs w:val="20"/>
-              </w:rPr>
-              <w:t>Wrap-up</w:t>
-            </w:r>
-          </w:p>
-        </w:tc>
-        <w:tc>
-          <w:tcPr>
-            <w:tcW w:w="2005" w:type="dxa"/>
-          </w:tcPr>
-          <w:p>
-            <w:pPr>
-              <w:rPr>
-                <w:rFonts w:asciiTheme="minorHAnsi" w:hAnsiTheme="minorHAnsi"/>
-                <w:sz w:val="20"/>
-                <w:szCs w:val="20"/>
-              </w:rPr>
-            </w:pPr>
-            <w:r>
-              <w:rPr>
-                <w:rFonts w:asciiTheme="minorHAnsi" w:hAnsiTheme="minorHAnsi"/>
-                <w:sz w:val="20"/>
-                <w:szCs w:val="20"/>
-              </w:rPr>
-              <w:t>Last class: Worst Chart Contest</w:t>
-            </w:r>
-          </w:p>
-        </w:tc>
-        <w:tc>
-          <w:tcPr>
-            <w:tcW w:w="2005" w:type="dxa"/>
-          </w:tcPr>
-          <w:p>
-            <w:pPr>
-              <w:rPr>
-                <w:sz w:val="20"/>
-                <w:szCs w:val="20"/>
-              </w:rPr>
-            </w:pPr>
-            <w:r>
-              <w:rPr>
-                <w:rFonts w:asciiTheme="minorHAnsi" w:hAnsiTheme="minorHAnsi"/>
-                <w:sz w:val="20"/>
-                <w:szCs w:val="20"/>
-              </w:rPr>
-              <w:t>___</w:t>
-            </w:r>
-          </w:p>
-        </w:tc>
-        <w:tc>
-          <w:tcPr>
-            <w:tcW w:w="2005" w:type="dxa"/>
-          </w:tcPr>
-          <w:p>
-            <w:pPr>
-              <w:rPr>
-                <w:sz w:val="20"/>
-                <w:szCs w:val="20"/>
-              </w:rPr>
-            </w:pPr>
-            <w:r>
-              <w:rPr>
-                <w:rFonts w:asciiTheme="minorHAnsi" w:hAnsiTheme="minorHAnsi"/>
-                <w:sz w:val="20"/>
-                <w:szCs w:val="20"/>
-              </w:rPr>
-              <w:t>____</w:t>
-            </w:r>
-          </w:p>
-        </w:tc>
-        <w:tc>
-          <w:tcPr>
-            <w:tcW w:w="1275" w:type="dxa"/>
-          </w:tcPr>
-          <w:p>
-            <w:pPr>
-              <w:rPr>
-                <w:rFonts w:asciiTheme="minorHAnsi" w:hAnsiTheme="minorHAnsi"/>
-                <w:sz w:val="20"/>
-                <w:szCs w:val="20"/>
-              </w:rPr>
-            </w:pPr>
-            <w:r>
-              <w:rPr>
-                <w:rFonts w:asciiTheme="minorHAnsi" w:hAnsiTheme="minorHAnsi"/>
-                <w:sz w:val="20"/>
-                <w:szCs w:val="20"/>
-              </w:rPr>
-              <w:t>P2 final notebook + final piece due</w:t>
+              <w:t>P2 final due</w:t>
             </w:r>
           </w:p>
         </w:tc>

</xml_diff>

<commit_message>
Mon 11/30 TBD; P2 presentations Dec 2 & 4, slides due Tue 12/1
Co-Authored-By: Claude Opus 5.5 <noreply@anthropic.com>
</commit_message>
<xml_diff>
--- a/DS2003_Syllabus Fall 2026.docx
+++ b/DS2003_Syllabus Fall 2026.docx
@@ -3633,7 +3633,6 @@
                 <w:sz w:val="20"/>
                 <w:szCs w:val="20"/>
               </w:rPr>
-              <w:t>P2 slides (Sun)</w:t>
             </w:r>
           </w:p>
         </w:tc>
@@ -3718,7 +3717,6 @@
         <w:tc>
           <w:tcPr>
             <w:tcW w:w="2005" w:type="dxa"/>
-            <w:shd w:val="clear" w:color="auto" w:fill="CAEDFB" w:themeFill="accent4" w:themeFillTint="33"/>
           </w:tcPr>
           <w:p>
             <w:pPr>
@@ -3734,7 +3732,7 @@
                 <w:sz w:val="20"/>
                 <w:szCs w:val="20"/>
               </w:rPr>
-              <w:t>Project Presentations (Day 1)</w:t>
+              <w:t>TBD</w:t>
             </w:r>
           </w:p>
         </w:tc>
@@ -3757,7 +3755,7 @@
                 <w:sz w:val="20"/>
                 <w:szCs w:val="20"/>
               </w:rPr>
-              <w:t>Project Presentations (Day 2)</w:t>
+              <w:t>Project Presentations (Day 1)</w:t>
             </w:r>
           </w:p>
         </w:tc>
@@ -3780,7 +3778,7 @@
                 <w:sz w:val="20"/>
                 <w:szCs w:val="20"/>
               </w:rPr>
-              <w:t>Project Presentations (Day 3)</w:t>
+              <w:t>Project Presentations (Day 2)</w:t>
             </w:r>
           </w:p>
         </w:tc>
@@ -3796,6 +3794,14 @@
                 <w:szCs w:val="20"/>
               </w:rPr>
             </w:pPr>
+            <w:r>
+              <w:rPr>
+                <w:rFonts w:asciiTheme="minorHAnsi" w:hAnsiTheme="minorHAnsi"/>
+                <w:sz w:val="20"/>
+                <w:szCs w:val="20"/>
+              </w:rPr>
+              <w:t>P2 slides (Tue)</w:t>
+            </w:r>
           </w:p>
         </w:tc>
       </w:tr>

</xml_diff>

<commit_message>
Add Labs 8 (ipywidgets) and 10 (annotation); alluvial worked example
- Lab 8: choosing controls, readable labels, fixed axes/colors,
  interactive_output layouts, linked views, sharing widget notebooks
- Lab 10 (light): five moves from exploratory to explanatory in
  matplotlib, plus exporting charts for the P2 final piece
- Optional alluvial-diagrams notebook for the Nov 23 work session
- Narrative structures + Segel & Heer reading move to Wed 10/21
- Gapminder and Titanic added to the datasets page

Co-Authored-By: Claude Opus 5.5 <noreply@anthropic.com>
</commit_message>
<xml_diff>
--- a/DS2003_Syllabus Fall 2026.docx
+++ b/DS2003_Syllabus Fall 2026.docx
@@ -2647,7 +2647,7 @@
                 <w:sz w:val="20"/>
                 <w:szCs w:val="20"/>
               </w:rPr>
-              <w:t>Storytelling and narrative structures</w:t>
+              <w:t>Storytelling</w:t>
             </w:r>
           </w:p>
         </w:tc>
@@ -2669,7 +2669,7 @@
                 <w:sz w:val="20"/>
                 <w:szCs w:val="20"/>
               </w:rPr>
-              <w:t>Interaction: why and when (taxonomies)</w:t>
+              <w:t>Narrative structures; interaction: why and when</w:t>
             </w:r>
           </w:p>
         </w:tc>
@@ -3246,7 +3246,7 @@
                 <w:sz w:val="20"/>
                 <w:szCs w:val="20"/>
               </w:rPr>
-              <w:t>Lab 10 (light): Planning your final piece</w:t>
+              <w:t>Lab 10 (light): Annotating charts</w:t>
             </w:r>
           </w:p>
         </w:tc>
@@ -3557,7 +3557,7 @@
                 <w:sz w:val="20"/>
                 <w:szCs w:val="20"/>
               </w:rPr>
-              <w:t>P2 work session</w:t>
+              <w:t>P2 work session (optional: alluvial diagrams)</w:t>
             </w:r>
           </w:p>
         </w:tc>

</xml_diff>